<commit_message>
feat: integrate React Native Mobile App (DongY App) documentation into report
</commit_message>
<xml_diff>
--- a/Bao_Cao_Tien_Do_TCM_System.docx
+++ b/Bao_Cao_Tien_Do_TCM_System.docx
@@ -18,6 +18,7 @@
     </w:p>
     <w:p>
       <w:pPr>
+        <w:pStyle w:val="Heading1"/>
         <w:spacing w:before="280" w:after="120"/>
       </w:pPr>
       <w:r>
@@ -31,6 +32,7 @@
     </w:p>
     <w:p>
       <w:pPr>
+        <w:pStyle w:val="Heading2"/>
         <w:spacing w:before="240" w:after="80"/>
       </w:pPr>
       <w:r>
@@ -84,7 +86,7 @@
         <w:t>Thời gian hoàn thiện:</w:t>
       </w:r>
       <w:r>
-        <w:t xml:space="preserve"> Ngày 23 tháng 07 năm 2026</w:t>
+        <w:t xml:space="preserve"> Ngày 24 tháng 07 năm 2026</w:t>
       </w:r>
     </w:p>
     <w:p>
@@ -100,6 +102,1011 @@
     </w:p>
     <w:p>
       <w:pPr>
+        <w:spacing w:before="280" w:after="200"/>
+        <w:jc w:val="center"/>
+      </w:pPr>
+      <w:r>
+        <w:rPr>
+          <w:rFonts w:ascii="Arial" w:hAnsi="Arial"/>
+          <w:b/>
+          <w:color w:val="0F766E"/>
+          <w:sz w:val="32"/>
+        </w:rPr>
+        <w:t>MỤC LỤC</w:t>
+      </w:r>
+    </w:p>
+    <w:p>
+      <w:fldSimple w:instr="TOC \o &quot;1-3&quot; \h \z \u"/>
+    </w:p>
+    <w:p>
+      <w:pPr>
+        <w:spacing w:before="60" w:after="40"/>
+        <w:ind w:left="0"/>
+      </w:pPr>
+      <w:r>
+        <w:rPr>
+          <w:rFonts w:ascii="Arial" w:hAnsi="Arial"/>
+          <w:b/>
+          <w:color w:val="0F766E"/>
+          <w:sz w:val="21"/>
+        </w:rPr>
+        <w:t xml:space="preserve">I. CƠ SỞ LÝ THUYẾT &amp; NỀN TẢNG Y KHOA — CÔNG NGHỆ AI </w:t>
+      </w:r>
+      <w:r>
+        <w:rPr>
+          <w:rFonts w:ascii="Arial" w:hAnsi="Arial"/>
+          <w:color w:val="94A3B8"/>
+          <w:sz w:val="17"/>
+        </w:rPr>
+        <w:t xml:space="preserve"> . . . . . . . . . . . . . . .  </w:t>
+      </w:r>
+      <w:r>
+        <w:rPr>
+          <w:rFonts w:ascii="Arial" w:hAnsi="Arial"/>
+          <w:b/>
+          <w:color w:val="0F766E"/>
+          <w:sz w:val="20"/>
+        </w:rPr>
+        <w:t>1</w:t>
+      </w:r>
+    </w:p>
+    <w:p>
+      <w:pPr>
+        <w:spacing w:before="20" w:after="40"/>
+        <w:ind w:left="360"/>
+      </w:pPr>
+      <w:r>
+        <w:rPr>
+          <w:rFonts w:ascii="Arial" w:hAnsi="Arial"/>
+          <w:b w:val="0"/>
+          <w:color w:val="334155"/>
+          <w:sz w:val="20"/>
+        </w:rPr>
+        <w:t xml:space="preserve">1. Lý luận Y học Cổ truyền (Đông y) và Phương pháp Tứ Chẩn Số </w:t>
+      </w:r>
+      <w:r>
+        <w:rPr>
+          <w:rFonts w:ascii="Arial" w:hAnsi="Arial"/>
+          <w:color w:val="94A3B8"/>
+          <w:sz w:val="17"/>
+        </w:rPr>
+        <w:t xml:space="preserve"> . . . . . . . .  </w:t>
+      </w:r>
+      <w:r>
+        <w:rPr>
+          <w:rFonts w:ascii="Arial" w:hAnsi="Arial"/>
+          <w:b w:val="0"/>
+          <w:color w:val="475569"/>
+          <w:sz w:val="20"/>
+        </w:rPr>
+        <w:t>1</w:t>
+      </w:r>
+    </w:p>
+    <w:p>
+      <w:pPr>
+        <w:spacing w:before="20" w:after="40"/>
+        <w:ind w:left="360"/>
+      </w:pPr>
+      <w:r>
+        <w:rPr>
+          <w:rFonts w:ascii="Arial" w:hAnsi="Arial"/>
+          <w:b w:val="0"/>
+          <w:color w:val="334155"/>
+          <w:sz w:val="20"/>
+        </w:rPr>
+        <w:t xml:space="preserve">2. Đồ thị Tri thức (Knowledge Graph) và Kiến trúc Graph RAG </w:t>
+      </w:r>
+      <w:r>
+        <w:rPr>
+          <w:rFonts w:ascii="Arial" w:hAnsi="Arial"/>
+          <w:color w:val="94A3B8"/>
+          <w:sz w:val="17"/>
+        </w:rPr>
+        <w:t xml:space="preserve"> . . . . . . . . .  </w:t>
+      </w:r>
+      <w:r>
+        <w:rPr>
+          <w:rFonts w:ascii="Arial" w:hAnsi="Arial"/>
+          <w:b w:val="0"/>
+          <w:color w:val="475569"/>
+          <w:sz w:val="20"/>
+        </w:rPr>
+        <w:t>2</w:t>
+      </w:r>
+    </w:p>
+    <w:p>
+      <w:pPr>
+        <w:spacing w:before="20" w:after="40"/>
+        <w:ind w:left="720"/>
+      </w:pPr>
+      <w:r>
+        <w:rPr>
+          <w:rFonts w:ascii="Arial" w:hAnsi="Arial"/>
+          <w:b w:val="0"/>
+          <w:color w:val="334155"/>
+          <w:sz w:val="20"/>
+        </w:rPr>
+        <w:t xml:space="preserve">2.1. Cấu trúc Thực thể (Nodes) trong Đồ thị Tri thức Đông y (TCM-KG) </w:t>
+      </w:r>
+      <w:r>
+        <w:rPr>
+          <w:rFonts w:ascii="Arial" w:hAnsi="Arial"/>
+          <w:color w:val="94A3B8"/>
+          <w:sz w:val="17"/>
+        </w:rPr>
+        <w:t xml:space="preserve"> . .  </w:t>
+      </w:r>
+      <w:r>
+        <w:rPr>
+          <w:rFonts w:ascii="Arial" w:hAnsi="Arial"/>
+          <w:b w:val="0"/>
+          <w:color w:val="475569"/>
+          <w:sz w:val="20"/>
+        </w:rPr>
+        <w:t>2</w:t>
+      </w:r>
+    </w:p>
+    <w:p>
+      <w:pPr>
+        <w:spacing w:before="20" w:after="40"/>
+        <w:ind w:left="720"/>
+      </w:pPr>
+      <w:r>
+        <w:rPr>
+          <w:rFonts w:ascii="Arial" w:hAnsi="Arial"/>
+          <w:b w:val="0"/>
+          <w:color w:val="334155"/>
+          <w:sz w:val="20"/>
+        </w:rPr>
+        <w:t xml:space="preserve">2.2. Mạng lưới Mối quan hệ (Edges) trong Đồ thị Tri thức </w:t>
+      </w:r>
+      <w:r>
+        <w:rPr>
+          <w:rFonts w:ascii="Arial" w:hAnsi="Arial"/>
+          <w:color w:val="94A3B8"/>
+          <w:sz w:val="17"/>
+        </w:rPr>
+        <w:t xml:space="preserve"> . . . . . . . .  </w:t>
+      </w:r>
+      <w:r>
+        <w:rPr>
+          <w:rFonts w:ascii="Arial" w:hAnsi="Arial"/>
+          <w:b w:val="0"/>
+          <w:color w:val="475569"/>
+          <w:sz w:val="20"/>
+        </w:rPr>
+        <w:t>2</w:t>
+      </w:r>
+    </w:p>
+    <w:p>
+      <w:pPr>
+        <w:spacing w:before="20" w:after="40"/>
+        <w:ind w:left="720"/>
+      </w:pPr>
+      <w:r>
+        <w:rPr>
+          <w:rFonts w:ascii="Arial" w:hAnsi="Arial"/>
+          <w:b w:val="0"/>
+          <w:color w:val="334155"/>
+          <w:sz w:val="20"/>
+        </w:rPr>
+        <w:t xml:space="preserve">2.3. Quy trình Suy luận Biện chứng Luận trị trên Đồ thị </w:t>
+      </w:r>
+      <w:r>
+        <w:rPr>
+          <w:rFonts w:ascii="Arial" w:hAnsi="Arial"/>
+          <w:color w:val="94A3B8"/>
+          <w:sz w:val="17"/>
+        </w:rPr>
+        <w:t xml:space="preserve"> . . . . . . . . .  </w:t>
+      </w:r>
+      <w:r>
+        <w:rPr>
+          <w:rFonts w:ascii="Arial" w:hAnsi="Arial"/>
+          <w:b w:val="0"/>
+          <w:color w:val="475569"/>
+          <w:sz w:val="20"/>
+        </w:rPr>
+        <w:t>3</w:t>
+      </w:r>
+    </w:p>
+    <w:p>
+      <w:pPr>
+        <w:spacing w:before="20" w:after="40"/>
+        <w:ind w:left="360"/>
+      </w:pPr>
+      <w:r>
+        <w:rPr>
+          <w:rFonts w:ascii="Arial" w:hAnsi="Arial"/>
+          <w:b w:val="0"/>
+          <w:color w:val="334155"/>
+          <w:sz w:val="20"/>
+        </w:rPr>
+        <w:t xml:space="preserve">3. Kiến trúc Graph RAG (Retrieval-Augmented Generation kết hợp Đồ thị) </w:t>
+      </w:r>
+      <w:r>
+        <w:rPr>
+          <w:rFonts w:ascii="Arial" w:hAnsi="Arial"/>
+          <w:color w:val="94A3B8"/>
+          <w:sz w:val="17"/>
+        </w:rPr>
+        <w:t xml:space="preserve"> . . .  </w:t>
+      </w:r>
+      <w:r>
+        <w:rPr>
+          <w:rFonts w:ascii="Arial" w:hAnsi="Arial"/>
+          <w:b w:val="0"/>
+          <w:color w:val="475569"/>
+          <w:sz w:val="20"/>
+        </w:rPr>
+        <w:t>3</w:t>
+      </w:r>
+    </w:p>
+    <w:p>
+      <w:pPr>
+        <w:spacing w:before="20" w:after="40"/>
+        <w:ind w:left="360"/>
+      </w:pPr>
+      <w:r>
+        <w:rPr>
+          <w:rFonts w:ascii="Arial" w:hAnsi="Arial"/>
+          <w:b w:val="0"/>
+          <w:color w:val="334155"/>
+          <w:sz w:val="20"/>
+        </w:rPr>
+        <w:t xml:space="preserve">4. Kiến trúc Đa phương thức &amp; Hệ sinh thái Ứng dụng Di động </w:t>
+      </w:r>
+      <w:r>
+        <w:rPr>
+          <w:rFonts w:ascii="Arial" w:hAnsi="Arial"/>
+          <w:color w:val="94A3B8"/>
+          <w:sz w:val="17"/>
+        </w:rPr>
+        <w:t xml:space="preserve"> . . . . . . . . .  </w:t>
+      </w:r>
+      <w:r>
+        <w:rPr>
+          <w:rFonts w:ascii="Arial" w:hAnsi="Arial"/>
+          <w:b w:val="0"/>
+          <w:color w:val="475569"/>
+          <w:sz w:val="20"/>
+        </w:rPr>
+        <w:t>4</w:t>
+      </w:r>
+    </w:p>
+    <w:p>
+      <w:pPr>
+        <w:spacing w:before="20" w:after="40"/>
+        <w:ind w:left="720"/>
+      </w:pPr>
+      <w:r>
+        <w:rPr>
+          <w:rFonts w:ascii="Arial" w:hAnsi="Arial"/>
+          <w:b w:val="0"/>
+          <w:color w:val="334155"/>
+          <w:sz w:val="20"/>
+        </w:rPr>
+        <w:t xml:space="preserve">4.1. Chuỗi Fallback VLM Đa tầng (Multi-tier VLM Fallback Chain) </w:t>
+      </w:r>
+      <w:r>
+        <w:rPr>
+          <w:rFonts w:ascii="Arial" w:hAnsi="Arial"/>
+          <w:color w:val="94A3B8"/>
+          <w:sz w:val="17"/>
+        </w:rPr>
+        <w:t xml:space="preserve"> . . . . .  </w:t>
+      </w:r>
+      <w:r>
+        <w:rPr>
+          <w:rFonts w:ascii="Arial" w:hAnsi="Arial"/>
+          <w:b w:val="0"/>
+          <w:color w:val="475569"/>
+          <w:sz w:val="20"/>
+        </w:rPr>
+        <w:t>4</w:t>
+      </w:r>
+    </w:p>
+    <w:p>
+      <w:pPr>
+        <w:spacing w:before="20" w:after="40"/>
+        <w:ind w:left="720"/>
+      </w:pPr>
+      <w:r>
+        <w:rPr>
+          <w:rFonts w:ascii="Arial" w:hAnsi="Arial"/>
+          <w:b w:val="0"/>
+          <w:color w:val="334155"/>
+          <w:sz w:val="20"/>
+        </w:rPr>
+        <w:t xml:space="preserve">4.2. Ứng dụng Di động React Native CLI (DongY Native App) </w:t>
+      </w:r>
+      <w:r>
+        <w:rPr>
+          <w:rFonts w:ascii="Arial" w:hAnsi="Arial"/>
+          <w:color w:val="94A3B8"/>
+          <w:sz w:val="17"/>
+        </w:rPr>
+        <w:t xml:space="preserve"> . . . . . . . .  </w:t>
+      </w:r>
+      <w:r>
+        <w:rPr>
+          <w:rFonts w:ascii="Arial" w:hAnsi="Arial"/>
+          <w:b w:val="0"/>
+          <w:color w:val="475569"/>
+          <w:sz w:val="20"/>
+        </w:rPr>
+        <w:t>4</w:t>
+      </w:r>
+    </w:p>
+    <w:p>
+      <w:pPr>
+        <w:spacing w:before="60" w:after="40"/>
+        <w:ind w:left="0"/>
+      </w:pPr>
+      <w:r>
+        <w:rPr>
+          <w:rFonts w:ascii="Arial" w:hAnsi="Arial"/>
+          <w:b/>
+          <w:color w:val="0F766E"/>
+          <w:sz w:val="21"/>
+        </w:rPr>
+        <w:t xml:space="preserve">II. CẤU TRÚC KIẾN TRÚC HỆ THỐNG VÀ THƯ VIỆN CÔNG NGHỆ </w:t>
+      </w:r>
+      <w:r>
+        <w:rPr>
+          <w:rFonts w:ascii="Arial" w:hAnsi="Arial"/>
+          <w:color w:val="94A3B8"/>
+          <w:sz w:val="17"/>
+        </w:rPr>
+        <w:t xml:space="preserve"> . . . . . . . . . . . . . .  </w:t>
+      </w:r>
+      <w:r>
+        <w:rPr>
+          <w:rFonts w:ascii="Arial" w:hAnsi="Arial"/>
+          <w:b/>
+          <w:color w:val="0F766E"/>
+          <w:sz w:val="20"/>
+        </w:rPr>
+        <w:t>5</w:t>
+      </w:r>
+    </w:p>
+    <w:p>
+      <w:pPr>
+        <w:spacing w:before="60" w:after="40"/>
+        <w:ind w:left="0"/>
+      </w:pPr>
+      <w:r>
+        <w:rPr>
+          <w:rFonts w:ascii="Arial" w:hAnsi="Arial"/>
+          <w:b/>
+          <w:color w:val="0F766E"/>
+          <w:sz w:val="21"/>
+        </w:rPr>
+        <w:t xml:space="preserve">III. QUÁ TRÌNH PHÁT TRIỂN &amp; TIẾN ĐỘ THEO TUẦN (TUẦN 1 — TUẦN 8) </w:t>
+      </w:r>
+      <w:r>
+        <w:rPr>
+          <w:rFonts w:ascii="Arial" w:hAnsi="Arial"/>
+          <w:color w:val="94A3B8"/>
+          <w:sz w:val="17"/>
+        </w:rPr>
+        <w:t xml:space="preserve"> . . . . . . . . .  </w:t>
+      </w:r>
+      <w:r>
+        <w:rPr>
+          <w:rFonts w:ascii="Arial" w:hAnsi="Arial"/>
+          <w:b/>
+          <w:color w:val="0F766E"/>
+          <w:sz w:val="20"/>
+        </w:rPr>
+        <w:t>6</w:t>
+      </w:r>
+    </w:p>
+    <w:p>
+      <w:pPr>
+        <w:spacing w:before="20" w:after="40"/>
+        <w:ind w:left="360"/>
+      </w:pPr>
+      <w:r>
+        <w:rPr>
+          <w:rFonts w:ascii="Arial" w:hAnsi="Arial"/>
+          <w:b w:val="0"/>
+          <w:color w:val="334155"/>
+          <w:sz w:val="20"/>
+        </w:rPr>
+        <w:t xml:space="preserve">Tuần 1: Nghiên cứu TCM Knowledge Graph &amp; Kiến trúc Graph RAG </w:t>
+      </w:r>
+      <w:r>
+        <w:rPr>
+          <w:rFonts w:ascii="Arial" w:hAnsi="Arial"/>
+          <w:color w:val="94A3B8"/>
+          <w:sz w:val="17"/>
+        </w:rPr>
+        <w:t xml:space="preserve"> . . . . . . . .  </w:t>
+      </w:r>
+      <w:r>
+        <w:rPr>
+          <w:rFonts w:ascii="Arial" w:hAnsi="Arial"/>
+          <w:b w:val="0"/>
+          <w:color w:val="475569"/>
+          <w:sz w:val="20"/>
+        </w:rPr>
+        <w:t>6</w:t>
+      </w:r>
+    </w:p>
+    <w:p>
+      <w:pPr>
+        <w:spacing w:before="20" w:after="40"/>
+        <w:ind w:left="360"/>
+      </w:pPr>
+      <w:r>
+        <w:rPr>
+          <w:rFonts w:ascii="Arial" w:hAnsi="Arial"/>
+          <w:b w:val="0"/>
+          <w:color w:val="334155"/>
+          <w:sz w:val="20"/>
+        </w:rPr>
+        <w:t xml:space="preserve">Tuần 2: Xây dựng &amp; Nạp dữ liệu vào TCM Knowledge Graph (Neo4j) </w:t>
+      </w:r>
+      <w:r>
+        <w:rPr>
+          <w:rFonts w:ascii="Arial" w:hAnsi="Arial"/>
+          <w:color w:val="94A3B8"/>
+          <w:sz w:val="17"/>
+        </w:rPr>
+        <w:t xml:space="preserve"> . . . . . . .  </w:t>
+      </w:r>
+      <w:r>
+        <w:rPr>
+          <w:rFonts w:ascii="Arial" w:hAnsi="Arial"/>
+          <w:b w:val="0"/>
+          <w:color w:val="475569"/>
+          <w:sz w:val="20"/>
+        </w:rPr>
+        <w:t>6</w:t>
+      </w:r>
+    </w:p>
+    <w:p>
+      <w:pPr>
+        <w:spacing w:before="20" w:after="40"/>
+        <w:ind w:left="360"/>
+      </w:pPr>
+      <w:r>
+        <w:rPr>
+          <w:rFonts w:ascii="Arial" w:hAnsi="Arial"/>
+          <w:b w:val="0"/>
+          <w:color w:val="334155"/>
+          <w:sz w:val="20"/>
+        </w:rPr>
+        <w:t xml:space="preserve">Tuần 3: Phát triển Module Xử lý Đa phương thức (Visual Input) </w:t>
+      </w:r>
+      <w:r>
+        <w:rPr>
+          <w:rFonts w:ascii="Arial" w:hAnsi="Arial"/>
+          <w:color w:val="94A3B8"/>
+          <w:sz w:val="17"/>
+        </w:rPr>
+        <w:t xml:space="preserve"> . . . . . . . .  </w:t>
+      </w:r>
+      <w:r>
+        <w:rPr>
+          <w:rFonts w:ascii="Arial" w:hAnsi="Arial"/>
+          <w:b w:val="0"/>
+          <w:color w:val="475569"/>
+          <w:sz w:val="20"/>
+        </w:rPr>
+        <w:t>6</w:t>
+      </w:r>
+    </w:p>
+    <w:p>
+      <w:pPr>
+        <w:spacing w:before="20" w:after="40"/>
+        <w:ind w:left="360"/>
+      </w:pPr>
+      <w:r>
+        <w:rPr>
+          <w:rFonts w:ascii="Arial" w:hAnsi="Arial"/>
+          <w:b w:val="0"/>
+          <w:color w:val="334155"/>
+          <w:sz w:val="20"/>
+        </w:rPr>
+        <w:t xml:space="preserve">Tuần 4: Xây dựng Hệ thống Hỏi đáp Đồ thị (Text-to-Cypher &amp; Graph QA) </w:t>
+      </w:r>
+      <w:r>
+        <w:rPr>
+          <w:rFonts w:ascii="Arial" w:hAnsi="Arial"/>
+          <w:color w:val="94A3B8"/>
+          <w:sz w:val="17"/>
+        </w:rPr>
+        <w:t xml:space="preserve"> . . . .  </w:t>
+      </w:r>
+      <w:r>
+        <w:rPr>
+          <w:rFonts w:ascii="Arial" w:hAnsi="Arial"/>
+          <w:b w:val="0"/>
+          <w:color w:val="475569"/>
+          <w:sz w:val="20"/>
+        </w:rPr>
+        <w:t>7</w:t>
+      </w:r>
+    </w:p>
+    <w:p>
+      <w:pPr>
+        <w:spacing w:before="20" w:after="40"/>
+        <w:ind w:left="360"/>
+      </w:pPr>
+      <w:r>
+        <w:rPr>
+          <w:rFonts w:ascii="Arial" w:hAnsi="Arial"/>
+          <w:b w:val="0"/>
+          <w:color w:val="334155"/>
+          <w:sz w:val="20"/>
+        </w:rPr>
+        <w:t xml:space="preserve">Tuần 5: Sinh Câu trả lời có Giải thích (Explainable AI Generation) </w:t>
+      </w:r>
+      <w:r>
+        <w:rPr>
+          <w:rFonts w:ascii="Arial" w:hAnsi="Arial"/>
+          <w:color w:val="94A3B8"/>
+          <w:sz w:val="17"/>
+        </w:rPr>
+        <w:t xml:space="preserve"> . . . . .  </w:t>
+      </w:r>
+      <w:r>
+        <w:rPr>
+          <w:rFonts w:ascii="Arial" w:hAnsi="Arial"/>
+          <w:b w:val="0"/>
+          <w:color w:val="475569"/>
+          <w:sz w:val="20"/>
+        </w:rPr>
+        <w:t>7</w:t>
+      </w:r>
+    </w:p>
+    <w:p>
+      <w:pPr>
+        <w:spacing w:before="20" w:after="40"/>
+        <w:ind w:left="360"/>
+      </w:pPr>
+      <w:r>
+        <w:rPr>
+          <w:rFonts w:ascii="Arial" w:hAnsi="Arial"/>
+          <w:b w:val="0"/>
+          <w:color w:val="334155"/>
+          <w:sz w:val="20"/>
+        </w:rPr>
+        <w:t xml:space="preserve">Tuần 6: Xây dựng Ứng dụng Di động React Native &amp; Web UI </w:t>
+      </w:r>
+      <w:r>
+        <w:rPr>
+          <w:rFonts w:ascii="Arial" w:hAnsi="Arial"/>
+          <w:color w:val="94A3B8"/>
+          <w:sz w:val="17"/>
+        </w:rPr>
+        <w:t xml:space="preserve"> . . . . . . . . . . .  </w:t>
+      </w:r>
+      <w:r>
+        <w:rPr>
+          <w:rFonts w:ascii="Arial" w:hAnsi="Arial"/>
+          <w:b w:val="0"/>
+          <w:color w:val="475569"/>
+          <w:sz w:val="20"/>
+        </w:rPr>
+        <w:t>7</w:t>
+      </w:r>
+    </w:p>
+    <w:p>
+      <w:pPr>
+        <w:spacing w:before="20" w:after="40"/>
+        <w:ind w:left="360"/>
+      </w:pPr>
+      <w:r>
+        <w:rPr>
+          <w:rFonts w:ascii="Arial" w:hAnsi="Arial"/>
+          <w:b w:val="0"/>
+          <w:color w:val="334155"/>
+          <w:sz w:val="20"/>
+        </w:rPr>
+        <w:t xml:space="preserve">Tuần 7: Kiểm thử Lâm sàng &amp; Tinh chỉnh Logic Đông Y Chuyên sâu </w:t>
+      </w:r>
+      <w:r>
+        <w:rPr>
+          <w:rFonts w:ascii="Arial" w:hAnsi="Arial"/>
+          <w:color w:val="94A3B8"/>
+          <w:sz w:val="17"/>
+        </w:rPr>
+        <w:t xml:space="preserve"> . . . . . . .  </w:t>
+      </w:r>
+      <w:r>
+        <w:rPr>
+          <w:rFonts w:ascii="Arial" w:hAnsi="Arial"/>
+          <w:b w:val="0"/>
+          <w:color w:val="475569"/>
+          <w:sz w:val="20"/>
+        </w:rPr>
+        <w:t>7</w:t>
+      </w:r>
+    </w:p>
+    <w:p>
+      <w:pPr>
+        <w:spacing w:before="20" w:after="40"/>
+        <w:ind w:left="360"/>
+      </w:pPr>
+      <w:r>
+        <w:rPr>
+          <w:rFonts w:ascii="Arial" w:hAnsi="Arial"/>
+          <w:b w:val="0"/>
+          <w:color w:val="334155"/>
+          <w:sz w:val="20"/>
+        </w:rPr>
+        <w:t xml:space="preserve">Tuần 8: Đóng gói Mã nguồn, Tối ưu hóa &amp; Báo cáo Tổng kết </w:t>
+      </w:r>
+      <w:r>
+        <w:rPr>
+          <w:rFonts w:ascii="Arial" w:hAnsi="Arial"/>
+          <w:color w:val="94A3B8"/>
+          <w:sz w:val="17"/>
+        </w:rPr>
+        <w:t xml:space="preserve"> . . . . . . . . . .  </w:t>
+      </w:r>
+      <w:r>
+        <w:rPr>
+          <w:rFonts w:ascii="Arial" w:hAnsi="Arial"/>
+          <w:b w:val="0"/>
+          <w:color w:val="475569"/>
+          <w:sz w:val="20"/>
+        </w:rPr>
+        <w:t>8</w:t>
+      </w:r>
+    </w:p>
+    <w:p>
+      <w:pPr>
+        <w:spacing w:before="60" w:after="40"/>
+        <w:ind w:left="0"/>
+      </w:pPr>
+      <w:r>
+        <w:rPr>
+          <w:rFonts w:ascii="Arial" w:hAnsi="Arial"/>
+          <w:b/>
+          <w:color w:val="0F766E"/>
+          <w:sz w:val="21"/>
+        </w:rPr>
+        <w:t xml:space="preserve">IV. CƠ SỞ THỰC HÀNH VÀ KẾT QUẢ THỰC NGHIỆM LÂM SÀNG </w:t>
+      </w:r>
+      <w:r>
+        <w:rPr>
+          <w:rFonts w:ascii="Arial" w:hAnsi="Arial"/>
+          <w:color w:val="94A3B8"/>
+          <w:sz w:val="17"/>
+        </w:rPr>
+        <w:t xml:space="preserve"> . . . . . . . . . . . . . . .  </w:t>
+      </w:r>
+      <w:r>
+        <w:rPr>
+          <w:rFonts w:ascii="Arial" w:hAnsi="Arial"/>
+          <w:b/>
+          <w:color w:val="0F766E"/>
+          <w:sz w:val="20"/>
+        </w:rPr>
+        <w:t>8</w:t>
+      </w:r>
+    </w:p>
+    <w:p>
+      <w:pPr>
+        <w:spacing w:before="20" w:after="40"/>
+        <w:ind w:left="360"/>
+      </w:pPr>
+      <w:r>
+        <w:rPr>
+          <w:rFonts w:ascii="Arial" w:hAnsi="Arial"/>
+          <w:b w:val="0"/>
+          <w:color w:val="334155"/>
+          <w:sz w:val="20"/>
+        </w:rPr>
+        <w:t xml:space="preserve">1. Mã Nguồn Xử lý Ứng dụng Di động React Native (DongY/App.tsx) </w:t>
+      </w:r>
+      <w:r>
+        <w:rPr>
+          <w:rFonts w:ascii="Arial" w:hAnsi="Arial"/>
+          <w:color w:val="94A3B8"/>
+          <w:sz w:val="17"/>
+        </w:rPr>
+        <w:t xml:space="preserve"> . . . . . . .  </w:t>
+      </w:r>
+      <w:r>
+        <w:rPr>
+          <w:rFonts w:ascii="Arial" w:hAnsi="Arial"/>
+          <w:b w:val="0"/>
+          <w:color w:val="475569"/>
+          <w:sz w:val="20"/>
+        </w:rPr>
+        <w:t>8</w:t>
+      </w:r>
+    </w:p>
+    <w:p>
+      <w:pPr>
+        <w:spacing w:before="20" w:after="40"/>
+        <w:ind w:left="360"/>
+      </w:pPr>
+      <w:r>
+        <w:rPr>
+          <w:rFonts w:ascii="Arial" w:hAnsi="Arial"/>
+          <w:b w:val="0"/>
+          <w:color w:val="334155"/>
+          <w:sz w:val="20"/>
+        </w:rPr>
+        <w:t xml:space="preserve">2. Thực thi Truy vấn Đồ thị Tri thức Neo4j (Cypher Code) </w:t>
+      </w:r>
+      <w:r>
+        <w:rPr>
+          <w:rFonts w:ascii="Arial" w:hAnsi="Arial"/>
+          <w:color w:val="94A3B8"/>
+          <w:sz w:val="17"/>
+        </w:rPr>
+        <w:t xml:space="preserve"> . . . . . . . . . .  </w:t>
+      </w:r>
+      <w:r>
+        <w:rPr>
+          <w:rFonts w:ascii="Arial" w:hAnsi="Arial"/>
+          <w:b w:val="0"/>
+          <w:color w:val="475569"/>
+          <w:sz w:val="20"/>
+        </w:rPr>
+        <w:t>9</w:t>
+      </w:r>
+    </w:p>
+    <w:p>
+      <w:pPr>
+        <w:spacing w:before="20" w:after="40"/>
+        <w:ind w:left="360"/>
+      </w:pPr>
+      <w:r>
+        <w:rPr>
+          <w:rFonts w:ascii="Arial" w:hAnsi="Arial"/>
+          <w:b w:val="0"/>
+          <w:color w:val="334155"/>
+          <w:sz w:val="20"/>
+        </w:rPr>
+        <w:t xml:space="preserve">3. Kết quả Chẩn đoán Lâm sàng Mẫu từ Hệ thống (System Diagnostic) </w:t>
+      </w:r>
+      <w:r>
+        <w:rPr>
+          <w:rFonts w:ascii="Arial" w:hAnsi="Arial"/>
+          <w:color w:val="94A3B8"/>
+          <w:sz w:val="17"/>
+        </w:rPr>
+        <w:t xml:space="preserve"> . . . . . .  </w:t>
+      </w:r>
+      <w:r>
+        <w:rPr>
+          <w:rFonts w:ascii="Arial" w:hAnsi="Arial"/>
+          <w:b w:val="0"/>
+          <w:color w:val="475569"/>
+          <w:sz w:val="20"/>
+        </w:rPr>
+        <w:t>9</w:t>
+      </w:r>
+    </w:p>
+    <w:p>
+      <w:pPr>
+        <w:spacing w:before="60" w:after="40"/>
+        <w:ind w:left="0"/>
+      </w:pPr>
+      <w:r>
+        <w:rPr>
+          <w:rFonts w:ascii="Arial" w:hAnsi="Arial"/>
+          <w:b/>
+          <w:color w:val="0F766E"/>
+          <w:sz w:val="21"/>
+        </w:rPr>
+        <w:t xml:space="preserve">V. CÁC VẤN ĐỀ KỸ THUẬT ĐÃ GIẢI QUYẾT VÀ ĐÁNH GIÁ TỔNG KẾT </w:t>
+      </w:r>
+      <w:r>
+        <w:rPr>
+          <w:rFonts w:ascii="Arial" w:hAnsi="Arial"/>
+          <w:color w:val="94A3B8"/>
+          <w:sz w:val="17"/>
+        </w:rPr>
+        <w:t xml:space="preserve"> . . . . . . . . . . . .  </w:t>
+      </w:r>
+      <w:r>
+        <w:rPr>
+          <w:rFonts w:ascii="Arial" w:hAnsi="Arial"/>
+          <w:b/>
+          <w:color w:val="0F766E"/>
+          <w:sz w:val="20"/>
+        </w:rPr>
+        <w:t>10</w:t>
+      </w:r>
+    </w:p>
+    <w:p>
+      <w:pPr>
+        <w:spacing w:before="20" w:after="40"/>
+        <w:ind w:left="360"/>
+      </w:pPr>
+      <w:r>
+        <w:rPr>
+          <w:rFonts w:ascii="Arial" w:hAnsi="Arial"/>
+          <w:b w:val="0"/>
+          <w:color w:val="334155"/>
+          <w:sz w:val="20"/>
+        </w:rPr>
+        <w:t xml:space="preserve">KẾT LUẬN TỔNG THỂ </w:t>
+      </w:r>
+      <w:r>
+        <w:rPr>
+          <w:rFonts w:ascii="Arial" w:hAnsi="Arial"/>
+          <w:color w:val="94A3B8"/>
+          <w:sz w:val="17"/>
+        </w:rPr>
+        <w:t xml:space="preserve"> . . . . . . . . . . . . . . . . . . . . . . . . . . . . . .  </w:t>
+      </w:r>
+      <w:r>
+        <w:rPr>
+          <w:rFonts w:ascii="Arial" w:hAnsi="Arial"/>
+          <w:b w:val="0"/>
+          <w:color w:val="475569"/>
+          <w:sz w:val="20"/>
+        </w:rPr>
+        <w:t>11</w:t>
+      </w:r>
+    </w:p>
+    <w:p>
+      <w:pPr>
+        <w:spacing w:before="280" w:after="160"/>
+        <w:jc w:val="center"/>
+      </w:pPr>
+      <w:r>
+        <w:rPr>
+          <w:rFonts w:ascii="Arial" w:hAnsi="Arial"/>
+          <w:b/>
+          <w:color w:val="0F766E"/>
+          <w:sz w:val="28"/>
+        </w:rPr>
+        <w:t>DANH MỤC HÌNH VẼ &amp; SƠ ĐỒ</w:t>
+      </w:r>
+    </w:p>
+    <w:p>
+      <w:pPr>
+        <w:spacing w:before="40" w:after="40"/>
+        <w:ind w:left="216"/>
+      </w:pPr>
+      <w:r>
+        <w:rPr>
+          <w:rFonts w:ascii="Arial" w:hAnsi="Arial"/>
+          <w:i/>
+          <w:color w:val="1E293B"/>
+          <w:sz w:val="20"/>
+        </w:rPr>
+        <w:t xml:space="preserve">Hình 1: Sơ đồ Mối quan hệ giữa các Thực thể trong Đồ thị Tri thức </w:t>
+      </w:r>
+      <w:r>
+        <w:rPr>
+          <w:rFonts w:ascii="Arial" w:hAnsi="Arial"/>
+          <w:color w:val="94A3B8"/>
+          <w:sz w:val="17"/>
+        </w:rPr>
+        <w:t xml:space="preserve"> . . . . . . .  </w:t>
+      </w:r>
+      <w:r>
+        <w:rPr>
+          <w:rFonts w:ascii="Arial" w:hAnsi="Arial"/>
+          <w:b/>
+          <w:color w:val="0F766E"/>
+          <w:sz w:val="20"/>
+        </w:rPr>
+        <w:t>2</w:t>
+      </w:r>
+    </w:p>
+    <w:p>
+      <w:pPr>
+        <w:spacing w:before="40" w:after="40"/>
+        <w:ind w:left="216"/>
+      </w:pPr>
+      <w:r>
+        <w:rPr>
+          <w:rFonts w:ascii="Arial" w:hAnsi="Arial"/>
+          <w:i/>
+          <w:color w:val="1E293B"/>
+          <w:sz w:val="20"/>
+        </w:rPr>
+        <w:t xml:space="preserve">Hình 2: Sơ đồ Luồng Suy luận và Truy xuất Ngữ cảnh Graph RAG </w:t>
+      </w:r>
+      <w:r>
+        <w:rPr>
+          <w:rFonts w:ascii="Arial" w:hAnsi="Arial"/>
+          <w:color w:val="94A3B8"/>
+          <w:sz w:val="17"/>
+        </w:rPr>
+        <w:t xml:space="preserve"> . . . . . . . . . .  </w:t>
+      </w:r>
+      <w:r>
+        <w:rPr>
+          <w:rFonts w:ascii="Arial" w:hAnsi="Arial"/>
+          <w:b/>
+          <w:color w:val="0F766E"/>
+          <w:sz w:val="20"/>
+        </w:rPr>
+        <w:t>3</w:t>
+      </w:r>
+    </w:p>
+    <w:p>
+      <w:pPr>
+        <w:spacing w:before="40" w:after="40"/>
+        <w:ind w:left="216"/>
+      </w:pPr>
+      <w:r>
+        <w:rPr>
+          <w:rFonts w:ascii="Arial" w:hAnsi="Arial"/>
+          <w:i/>
+          <w:color w:val="1E293B"/>
+          <w:sz w:val="20"/>
+        </w:rPr>
+        <w:t xml:space="preserve">Hình 3: Sơ đồ Chuỗi Fallback VLM 3 Tầng Tự động </w:t>
+      </w:r>
+      <w:r>
+        <w:rPr>
+          <w:rFonts w:ascii="Arial" w:hAnsi="Arial"/>
+          <w:color w:val="94A3B8"/>
+          <w:sz w:val="17"/>
+        </w:rPr>
+        <w:t xml:space="preserve"> . . . . . . . . . . . . . . . .  </w:t>
+      </w:r>
+      <w:r>
+        <w:rPr>
+          <w:rFonts w:ascii="Arial" w:hAnsi="Arial"/>
+          <w:b/>
+          <w:color w:val="0F766E"/>
+          <w:sz w:val="20"/>
+        </w:rPr>
+        <w:t>4</w:t>
+      </w:r>
+    </w:p>
+    <w:p>
+      <w:pPr>
+        <w:spacing w:before="40" w:after="40"/>
+        <w:ind w:left="216"/>
+      </w:pPr>
+      <w:r>
+        <w:rPr>
+          <w:rFonts w:ascii="Arial" w:hAnsi="Arial"/>
+          <w:i/>
+          <w:color w:val="1E293B"/>
+          <w:sz w:val="20"/>
+        </w:rPr>
+        <w:t xml:space="preserve">Hình 4: Sơ đồ Kiến trúc Tổng thể Hệ thống Microservices &amp; AI Engine </w:t>
+      </w:r>
+      <w:r>
+        <w:rPr>
+          <w:rFonts w:ascii="Arial" w:hAnsi="Arial"/>
+          <w:color w:val="94A3B8"/>
+          <w:sz w:val="17"/>
+        </w:rPr>
+        <w:t xml:space="preserve"> . . . . . .  </w:t>
+      </w:r>
+      <w:r>
+        <w:rPr>
+          <w:rFonts w:ascii="Arial" w:hAnsi="Arial"/>
+          <w:b/>
+          <w:color w:val="0F766E"/>
+          <w:sz w:val="20"/>
+        </w:rPr>
+        <w:t>5</w:t>
+      </w:r>
+    </w:p>
+    <w:p>
+      <w:pPr>
+        <w:spacing w:before="160" w:after="240"/>
+      </w:pPr>
+      <w:r>
+        <w:rPr>
+          <w:color w:val="CCFBF1"/>
+        </w:rPr>
+        <w:t>_________________________________________________________________________________</w:t>
+      </w:r>
+    </w:p>
+    <w:p>
+      <w:pPr>
+        <w:pStyle w:val="Heading1"/>
         <w:spacing w:before="280" w:after="120"/>
       </w:pPr>
       <w:r>
@@ -113,6 +1120,7 @@
     </w:p>
     <w:p>
       <w:pPr>
+        <w:pStyle w:val="Heading2"/>
         <w:spacing w:before="240" w:after="80"/>
       </w:pPr>
       <w:r>
@@ -278,7 +1286,7 @@
         <w:t>Vọng chẩn</w:t>
       </w:r>
       <w:r>
-        <w:t xml:space="preserve"> (thông qua Mô hình Thị giác Máy tính VLM) và </w:t>
+        <w:t xml:space="preserve"> (thông qua Mô hình Thị giác Máy tính VLM kết hợp Camera Native di động) và </w:t>
       </w:r>
       <w:r>
         <w:rPr>
@@ -287,7 +1295,7 @@
         <w:t>Vấn chẩn</w:t>
       </w:r>
       <w:r>
-        <w:t xml:space="preserve"> (thông qua Biểu mẫu cấu trúc 10 trường + Ngôn ngữ tự nhiên với Chatbot AI).</w:t>
+        <w:t xml:space="preserve"> (thông qua Biểu mẫu cấu trúc 10 trường + Ngôn ngữ tự nhiên trên cả Ứng dụng Di động React Native và Trình duyệt Web).</w:t>
       </w:r>
     </w:p>
     <w:p>
@@ -303,6 +1311,7 @@
     </w:p>
     <w:p>
       <w:pPr>
+        <w:pStyle w:val="Heading2"/>
         <w:spacing w:before="240" w:after="80"/>
       </w:pPr>
       <w:r>
@@ -316,6 +1325,7 @@
     </w:p>
     <w:p>
       <w:pPr>
+        <w:pStyle w:val="Heading3"/>
         <w:spacing w:before="200" w:after="80"/>
       </w:pPr>
       <w:r>
@@ -505,6 +1515,7 @@
     </w:p>
     <w:p>
       <w:pPr>
+        <w:pStyle w:val="Heading3"/>
         <w:spacing w:before="200" w:after="80"/>
       </w:pPr>
       <w:r>
@@ -1278,6 +2289,7 @@
     </w:tbl>
     <w:p>
       <w:pPr>
+        <w:pStyle w:val="Heading3"/>
         <w:spacing w:before="200" w:after="80"/>
       </w:pPr>
       <w:r>
@@ -1439,6 +2451,7 @@
     </w:p>
     <w:p>
       <w:pPr>
+        <w:pStyle w:val="Heading2"/>
         <w:spacing w:before="240" w:after="80"/>
       </w:pPr>
       <w:r>
@@ -1550,46 +2563,8 @@
         </w:rPr>
         <w:t>Pha Retrieval (Truy xuất &amp; Scoring):</w:t>
       </w:r>
-      <w:r/>
-    </w:p>
-    <w:p>
-      <w:pPr>
-        <w:pStyle w:val="ListBullet"/>
-        <w:spacing w:before="40" w:after="40"/>
-      </w:pPr>
-      <w:r>
-        <w:t xml:space="preserve">Sử dụng thuật toán so khớp mờ Fuzzy Search với toán tử </w:t>
-      </w:r>
-      <w:r>
-        <w:rPr>
-          <w:rFonts w:ascii="Consolas" w:hAnsi="Consolas"/>
-          <w:color w:val="0F766E"/>
-          <w:sz w:val="20"/>
-        </w:rPr>
-        <w:t>CONTAINS</w:t>
-      </w:r>
-      <w:r>
-        <w:t xml:space="preserve"> kết hợp bỏ dấu thanh (</w:t>
-      </w:r>
-      <w:r>
-        <w:rPr>
-          <w:rFonts w:ascii="Consolas" w:hAnsi="Consolas"/>
-          <w:color w:val="0F766E"/>
-          <w:sz w:val="20"/>
-        </w:rPr>
-        <w:t>_fold_vn</w:t>
-      </w:r>
-      <w:r>
-        <w:t>).</w:t>
-      </w:r>
-    </w:p>
-    <w:p>
-      <w:pPr>
-        <w:pStyle w:val="ListBullet"/>
-        <w:spacing w:before="40" w:after="40"/>
-      </w:pPr>
-      <w:r>
-        <w:t xml:space="preserve">Áp dụng công thức trọng số </w:t>
+      <w:r>
+        <w:t xml:space="preserve"> Sử dụng thuật toán so khớp mờ Fuzzy Search kết hợp công thức trọng số </w:t>
       </w:r>
       <w:r>
         <w:rPr>
@@ -1611,41 +2586,6 @@
     </w:p>
     <w:p>
       <w:pPr>
-        <w:spacing w:before="40" w:after="80" w:line="276" w:lineRule="auto"/>
-      </w:pPr>
-      <w:r>
-        <w:t xml:space="preserve">Giúp triệu chứng có tính đặc hiệu cao (như </w:t>
-      </w:r>
-      <w:r>
-        <w:rPr>
-          <w:i/>
-        </w:rPr>
-        <w:t>rìa lưỡi hằn răng</w:t>
-      </w:r>
-      <w:r>
-        <w:t xml:space="preserve">, </w:t>
-      </w:r>
-      <w:r>
-        <w:rPr>
-          <w:i/>
-        </w:rPr>
-        <w:t>quầng đen dưới mắt</w:t>
-      </w:r>
-      <w:r>
-        <w:t xml:space="preserve">) đóng góp trọng số lớn hơn triệu chứng chung chung (như </w:t>
-      </w:r>
-      <w:r>
-        <w:rPr>
-          <w:i/>
-        </w:rPr>
-        <w:t>mệt mỏi</w:t>
-      </w:r>
-      <w:r>
-        <w:t>).</w:t>
-      </w:r>
-    </w:p>
-    <w:p>
-      <w:pPr>
         <w:pStyle w:val="ListNumber"/>
         <w:spacing w:before="40" w:after="40"/>
       </w:pPr>
@@ -1657,7 +2597,7 @@
         <w:t>Pha Generation (Sinh giải thích):</w:t>
       </w:r>
       <w:r>
-        <w:t xml:space="preserve"> Tuần tự hóa Subgraph thu được thành ngữ cảnh chuẩn, đưa vào Prompt kỷ luật thép để sinh báo cáo biện chứng 5 phần và hiển thị cây đồ thị tương tác bằng thư viện Vis-Network.</w:t>
+        <w:t xml:space="preserve"> Tuần tự hóa Subgraph thu được thành ngữ cảnh chuẩn, đưa vào Prompt kỷ luật thép để sinh báo cáo biện chứng 5 phần và hiển thị cây đồ thị tương tác.</w:t>
       </w:r>
     </w:p>
     <w:p>
@@ -1673,6 +2613,7 @@
     </w:p>
     <w:p>
       <w:pPr>
+        <w:pStyle w:val="Heading2"/>
         <w:spacing w:before="240" w:after="80"/>
       </w:pPr>
       <w:r>
@@ -1681,11 +2622,12 @@
           <w:color w:val="0D9488"/>
           <w:sz w:val="26"/>
         </w:rPr>
-        <w:t>4. Kiến trúc Đa phương thức (Multimodal VLM Architecture)</w:t>
+        <w:t>4. Kiến trúc Đa phương thức &amp; Hệ sinh thái Ứng dụng Di động (Mobile Ecosystem)</w:t>
       </w:r>
     </w:p>
     <w:p>
       <w:pPr>
+        <w:pStyle w:val="Heading3"/>
         <w:spacing w:before="200" w:after="80"/>
       </w:pPr>
       <w:r>
@@ -1768,54 +2710,39 @@
         <w:t>src/cloud_vlm_client.py</w:t>
       </w:r>
       <w:r>
-        <w:t>:</w:t>
+        <w:t xml:space="preserve">: </w:t>
+      </w:r>
+      <w:r>
+        <w:rPr>
+          <w:b/>
+        </w:rPr>
+        <w:t>DashScope API (Qwen3-VL-32B-Thinking Cloud)</w:t>
+      </w:r>
+      <w:r>
+        <w:t xml:space="preserve"> $\rightarrow$ </w:t>
+      </w:r>
+      <w:r>
+        <w:rPr>
+          <w:b/>
+        </w:rPr>
+        <w:t>Requesty Router (Parasail Qwen2.5-VL-72B)</w:t>
+      </w:r>
+      <w:r>
+        <w:t xml:space="preserve"> $\rightarrow$ </w:t>
+      </w:r>
+      <w:r>
+        <w:rPr>
+          <w:b/>
+        </w:rPr>
+        <w:t>Ollama Engine (LLaVA-7B Local Engine)</w:t>
+      </w:r>
+      <w:r>
+        <w:t>.</w:t>
       </w:r>
     </w:p>
     <w:p>
       <w:pPr>
-        <w:spacing w:before="80" w:after="160"/>
-      </w:pPr>
-      <w:r>
-        <w:rPr>
-          <w:rFonts w:ascii="Consolas" w:hAnsi="Consolas"/>
-          <w:color w:val="1E293B"/>
-          <w:sz w:val="19"/>
-        </w:rPr>
-        <w:t>[Yêu cầu Vọng chẩn]</w:t>
-        <w:br/>
-        <w:t xml:space="preserve">       │</w:t>
-        <w:br/>
-        <w:t xml:space="preserve">       ▼</w:t>
-        <w:br/>
-        <w:t>┌────────────────────────────────────────────────────────┐</w:t>
-        <w:br/>
-        <w:t>│ Tầng 1: DashScope API (Qwen3-VL-32B-Thinking Cloud)    │ ──(Thành công)──► Đầu ra JSON chuẩn</w:t>
-        <w:br/>
-        <w:t>└────────────────────────────────────────────────────────┘</w:t>
-        <w:br/>
-        <w:t xml:space="preserve">       │ (Gặp lỗi HTTP / Timeout / 404 / Hết Quota)</w:t>
-        <w:br/>
-        <w:t xml:space="preserve">       ▼</w:t>
-        <w:br/>
-        <w:t>┌────────────────────────────────────────────────────────┐</w:t>
-        <w:br/>
-        <w:t>│ Tầng 2: Requesty Router (Parasail Qwen2.5-VL-72B)      │ ──(Thành công)──► Đầu ra JSON chuẩn</w:t>
-        <w:br/>
-        <w:t>└────────────────────────────────────────────────────────┘</w:t>
-        <w:br/>
-        <w:t xml:space="preserve">       │ (Mất kết nối Internet)</w:t>
-        <w:br/>
-        <w:t xml:space="preserve">       ▼</w:t>
-        <w:br/>
-        <w:t>┌────────────────────────────────────────────────────────┐</w:t>
-        <w:br/>
-        <w:t>│ Tầng 3: Ollama Engine (LLaVA-7B Local Engine)          │ ──(Thành công)──► Đầu ra JSON chuẩn</w:t>
-        <w:br/>
-        <w:t>└────────────────────────────────────────────────────────┘</w:t>
-      </w:r>
-    </w:p>
-    <w:p>
-      <w:pPr>
+        <w:pStyle w:val="Heading3"/>
         <w:spacing w:before="200" w:after="80"/>
       </w:pPr>
       <w:r>
@@ -1824,7 +2751,7 @@
           <w:color w:val="14B8A6"/>
           <w:sz w:val="23"/>
         </w:rPr>
-        <w:t>4.2. Hiệu chỉnh Prompt Vọng chẩn Trực quan Lâm sàng</w:t>
+        <w:t>4.2. Ứng dụng Di động React Native CLI (`DongY` Native App)</w:t>
       </w:r>
     </w:p>
     <w:p>
@@ -1832,7 +2759,41 @@
         <w:spacing w:before="40" w:after="80" w:line="276" w:lineRule="auto"/>
       </w:pPr>
       <w:r>
-        <w:t xml:space="preserve">Mô hình Vision được tinh chỉnh bằng </w:t>
+        <w:t xml:space="preserve">Hệ thống phát triển ứng dụng di động native chuyên dụng </w:t>
+      </w:r>
+      <w:r>
+        <w:rPr>
+          <w:b/>
+        </w:rPr>
+        <w:t>`DongY`</w:t>
+      </w:r>
+      <w:r>
+        <w:t xml:space="preserve"> bằng </w:t>
+      </w:r>
+      <w:r>
+        <w:rPr>
+          <w:b/>
+        </w:rPr>
+        <w:t>React Native CLI (TypeScript / React 19 / RN 0.86)</w:t>
+      </w:r>
+      <w:r>
+        <w:t xml:space="preserve"> dành cho Android và iOS:</w:t>
+      </w:r>
+    </w:p>
+    <w:p>
+      <w:pPr>
+        <w:pStyle w:val="ListBullet"/>
+        <w:spacing w:before="40" w:after="40"/>
+      </w:pPr>
+      <w:r/>
+      <w:r>
+        <w:rPr>
+          <w:b/>
+        </w:rPr>
+        <w:t>Tích hợp Camera Native (`react-native-image-picker`):</w:t>
+      </w:r>
+      <w:r>
+        <w:t xml:space="preserve"> Cho phép người bệnh chụp ảnh sắc mặt và rêu lưỡi trực tiếp từ Camera điện thoại hoặc chọn từ Thư viện ảnh, tự động xử lý cấp quyền Android Runtime Permissions (</w:t>
       </w:r>
       <w:r>
         <w:rPr>
@@ -1840,10 +2801,35 @@
           <w:color w:val="0F766E"/>
           <w:sz w:val="20"/>
         </w:rPr>
-        <w:t>FACE_JSON_PROMPT_VI</w:t>
-      </w:r>
-      <w:r>
-        <w:t xml:space="preserve"> và </w:t>
+        <w:t>PermissionsAndroid.request</w:t>
+      </w:r>
+      <w:r>
+        <w:t>).</w:t>
+      </w:r>
+    </w:p>
+    <w:p>
+      <w:pPr>
+        <w:pStyle w:val="ListBullet"/>
+        <w:spacing w:before="40" w:after="40"/>
+      </w:pPr>
+      <w:r/>
+      <w:r>
+        <w:rPr>
+          <w:b/>
+        </w:rPr>
+        <w:t>Hệ thống Xác thực &amp; Phân quyền (Firebase Auth &amp; JWT):</w:t>
+      </w:r>
+      <w:r>
+        <w:t xml:space="preserve"> Tích hợp </w:t>
+      </w:r>
+      <w:r>
+        <w:rPr>
+          <w:b/>
+        </w:rPr>
+        <w:t>Firebase Auth</w:t>
+      </w:r>
+      <w:r>
+        <w:t xml:space="preserve"> (</w:t>
       </w:r>
       <w:r>
         <w:rPr>
@@ -1851,10 +2837,10 @@
           <w:color w:val="0F766E"/>
           <w:sz w:val="20"/>
         </w:rPr>
-        <w:t>TONGUE_JSON_PROMPT_VI</w:t>
-      </w:r>
-      <w:r>
-        <w:t xml:space="preserve"> trong </w:t>
+        <w:t>signInWithEmailAndPassword</w:t>
+      </w:r>
+      <w:r>
+        <w:t xml:space="preserve">, </w:t>
       </w:r>
       <w:r>
         <w:rPr>
@@ -1862,76 +2848,41 @@
           <w:color w:val="0F766E"/>
           <w:sz w:val="20"/>
         </w:rPr>
-        <w:t>src/prompts.py</w:t>
-      </w:r>
-      <w:r>
-        <w:t xml:space="preserve"> với các quy tắc soi ảnh lâm sàng trực quan:</w:t>
-      </w:r>
-    </w:p>
-    <w:p>
-      <w:pPr>
-        <w:pStyle w:val="ListBullet"/>
-        <w:spacing w:before="40" w:after="40"/>
-      </w:pPr>
-      <w:r/>
-      <w:r>
-        <w:rPr>
-          <w:b/>
-        </w:rPr>
-        <w:t>Loại bỏ nhiễu môi trường:</w:t>
-      </w:r>
-      <w:r>
-        <w:t xml:space="preserve"> Bắt buộc VLM bỏ qua màu sắc đèn phòng và màu tường nền phía sau.</w:t>
-      </w:r>
-    </w:p>
-    <w:p>
-      <w:pPr>
-        <w:pStyle w:val="ListBullet"/>
-        <w:spacing w:before="40" w:after="40"/>
-      </w:pPr>
-      <w:r/>
-      <w:r>
-        <w:rPr>
-          <w:b/>
-        </w:rPr>
-        <w:t>Quy tắc Sắc mặt (`sac_mat`):</w:t>
-      </w:r>
-      <w:r/>
-    </w:p>
-    <w:p>
-      <w:pPr>
-        <w:pStyle w:val="ListBullet"/>
-        <w:spacing w:before="40" w:after="40"/>
-      </w:pPr>
-      <w:r/>
+        <w:t>createUserWithEmailAndPassword</w:t>
+      </w:r>
+      <w:r>
+        <w:t xml:space="preserve">, </w:t>
+      </w:r>
       <w:r>
         <w:rPr>
           <w:rFonts w:ascii="Consolas" w:hAnsi="Consolas"/>
           <w:color w:val="0F766E"/>
           <w:sz w:val="20"/>
         </w:rPr>
-        <w:t>"trắng nhợt"</w:t>
-      </w:r>
-      <w:r>
-        <w:t>: Bắt buộc chọn khi da mặt tái bệch, nhợt nhạt, khuôn mặt gầy hốc hác, sắc da &amp; bờ môi nhạt màu mất sắc máu do thiếu máu / suy nhược.</w:t>
-      </w:r>
-    </w:p>
-    <w:p>
-      <w:pPr>
-        <w:pStyle w:val="ListBullet"/>
-        <w:spacing w:before="40" w:after="40"/>
-      </w:pPr>
-      <w:r/>
+        <w:t>onAuthStateChanged</w:t>
+      </w:r>
+      <w:r>
+        <w:t>), tự động trao đổi ID Token với Backend (</w:t>
+      </w:r>
       <w:r>
         <w:rPr>
           <w:rFonts w:ascii="Consolas" w:hAnsi="Consolas"/>
           <w:color w:val="0F766E"/>
           <w:sz w:val="20"/>
         </w:rPr>
-        <w:t>"vàng úa"</w:t>
-      </w:r>
-      <w:r>
-        <w:t>: Bắt buộc chọn khi da mặt ngả màu vàng hoặc vàng cam rõ rệt (trẻ em bị vàng da sơ sinh, bệnh nhân hoàng đản/gan).</w:t>
+        <w:t>/api/auth/firebase-login</w:t>
+      </w:r>
+      <w:r>
+        <w:t>) để nhận JWT Token và Phân quyền Vai trò (</w:t>
+      </w:r>
+      <w:r>
+        <w:rPr>
+          <w:b/>
+        </w:rPr>
+        <w:t>Bác sĩ / Bệnh nhân</w:t>
+      </w:r>
+      <w:r>
+        <w:t>).</w:t>
       </w:r>
     </w:p>
     <w:p>
@@ -1940,16 +2891,25 @@
         <w:spacing w:before="40" w:after="40"/>
       </w:pPr>
       <w:r/>
+      <w:r>
+        <w:rPr>
+          <w:b/>
+        </w:rPr>
+        <w:t>Kết nối Đám mây Ngrok Tunnel:</w:t>
+      </w:r>
+      <w:r>
+        <w:t xml:space="preserve"> Tự động đính kèm Header bypass </w:t>
+      </w:r>
       <w:r>
         <w:rPr>
           <w:rFonts w:ascii="Consolas" w:hAnsi="Consolas"/>
           <w:color w:val="0F766E"/>
           <w:sz w:val="20"/>
         </w:rPr>
-        <w:t>"hồng hào bình thường"</w:t>
-      </w:r>
-      <w:r>
-        <w:t>: Chọn khi da mặt đầy đặn, tươi nhuận, hồng tươi khỏe mạnh có sức sống.</w:t>
+        <w:t>ngrok-skip-browser-warning: true</w:t>
+      </w:r>
+      <w:r>
+        <w:t xml:space="preserve"> trong mọi HTTP request bất đồng bộ, giúp App kết nối ổn định với Backend FastAPI qua Internet.</w:t>
       </w:r>
     </w:p>
     <w:p>
@@ -1962,59 +2922,10 @@
         <w:rPr>
           <w:b/>
         </w:rPr>
-        <w:t>Quy tắc Quầng thâm (`quang_tham`):</w:t>
-      </w:r>
-      <w:r>
-        <w:t xml:space="preserve"> Soi kỹ bọng mi mắt dưới $\rightarrow$ chọn </w:t>
-      </w:r>
-      <w:r>
-        <w:rPr>
-          <w:rFonts w:ascii="Consolas" w:hAnsi="Consolas"/>
-          <w:color w:val="0F766E"/>
-          <w:sz w:val="20"/>
-        </w:rPr>
-        <w:t>"có"</w:t>
-      </w:r>
-      <w:r>
-        <w:t xml:space="preserve"> khi có bóng thâm, nếp nhăn sạm nâu rõ rệt.</w:t>
-      </w:r>
-    </w:p>
-    <w:p>
-      <w:pPr>
-        <w:pStyle w:val="ListBullet"/>
-        <w:spacing w:before="40" w:after="40"/>
-      </w:pPr>
-      <w:r/>
-      <w:r>
-        <w:rPr>
-          <w:b/>
-        </w:rPr>
-        <w:t>Quy tắc Ban đỏ (`ban_do`):</w:t>
-      </w:r>
-      <w:r>
-        <w:t xml:space="preserve"> Chỉ chọn </w:t>
-      </w:r>
-      <w:r>
-        <w:rPr>
-          <w:rFonts w:ascii="Consolas" w:hAnsi="Consolas"/>
-          <w:color w:val="0F766E"/>
-          <w:sz w:val="20"/>
-        </w:rPr>
-        <w:t>"có"</w:t>
-      </w:r>
-      <w:r>
-        <w:t xml:space="preserve"> khi thấy mảng phát ban đỏ, mảng xuất huyết hoặc ban đỏ hình bướm diện rộng (Lupus, sởi). Nốt mụn nhỏ, nốt ruồi, tàn nhang hoặc vết thâm mụn nhẹ $\rightarrow$ Mặc định </w:t>
-      </w:r>
-      <w:r>
-        <w:rPr>
-          <w:rFonts w:ascii="Consolas" w:hAnsi="Consolas"/>
-          <w:color w:val="0F766E"/>
-          <w:sz w:val="20"/>
-        </w:rPr>
-        <w:t>"không"</w:t>
-      </w:r>
-      <w:r>
-        <w:t>.</w:t>
+        <w:t>Lịch sử Chẩn đoán &amp; Chatbot Tư vấn Y khoa:</w:t>
+      </w:r>
+      <w:r>
+        <w:t xml:space="preserve"> Tích hợp Modal xem lịch sử chẩn đoán cá nhân và khung chat tương tác trực tiếp dành cho Bác sĩ YHCT tra cứu kiến thức bệnh lý.</w:t>
       </w:r>
     </w:p>
     <w:p>
@@ -2030,6 +2941,7 @@
     </w:p>
     <w:p>
       <w:pPr>
+        <w:pStyle w:val="Heading1"/>
         <w:spacing w:before="280" w:after="120"/>
       </w:pPr>
       <w:r>
@@ -2101,7 +3013,7 @@
         <w:spacing w:before="40" w:after="80" w:line="276" w:lineRule="auto"/>
       </w:pPr>
       <w:r>
-        <w:t>Hệ thống được phát triển theo mô hình Microservices decoupled toàn diện giữa Frontend Web UI, Backend Core RestAPI và Hệ sinh thái AI Engine / Graph Database:</w:t>
+        <w:t>Hệ thống được phát triển theo mô hình Microservices decoupled toàn diện giữa Mobile App, Frontend Web UI, Backend Core RestAPI và Hệ sinh thái AI Engine / Graph Database:</w:t>
       </w:r>
     </w:p>
     <w:p>
@@ -2114,71 +3026,76 @@
           <w:color w:val="1E293B"/>
           <w:sz w:val="19"/>
         </w:rPr>
-        <w:t xml:space="preserve">               ┌────────────────────────────────────────┐</w:t>
+        <w:t xml:space="preserve">  ┌─────────────────────────────────┐        ┌──────────────────────────────────┐</w:t>
         <w:br/>
-        <w:t xml:space="preserve">               │    Frontend Web UI (index.html)        │</w:t>
+        <w:t xml:space="preserve">  │  React Native App (DongY App)   │        │   Frontend Web UI (index.html)   │</w:t>
         <w:br/>
-        <w:t xml:space="preserve">               │  - Responsive UI (TailwindCSS)         │</w:t>
+        <w:t xml:space="preserve">  │  - iOS / Android Native UI      │        │ - Responsive UI (TailwindCSS)    │</w:t>
         <w:br/>
-        <w:t xml:space="preserve">               │  - Form Vấn chẩn 10 trường             │</w:t>
+        <w:t xml:space="preserve">  │  - Firebase Auth &amp; User Roles   │        │ - Form Vấn chẩn 10 trường        │</w:t>
         <w:br/>
-        <w:t xml:space="preserve">               │  - Upload Vọng chẩn (Mặt / Lưỡi)       │</w:t>
+        <w:t xml:space="preserve">  │  - Camera Picker (Mặt/Lưỡi)     │        │ - Vis-Network Interactive Graph  │</w:t>
         <w:br/>
-        <w:t xml:space="preserve">               │  - Vis-Network Interactive Graph       │</w:t>
+        <w:t xml:space="preserve">  └────────────────┬────────────────┘        └─────────────────┬────────────────┘</w:t>
         <w:br/>
-        <w:t xml:space="preserve">               └───────────────────┬────────────────────┘</w:t>
+        <w:t xml:space="preserve">                   │                                           │</w:t>
         <w:br/>
-        <w:t xml:space="preserve">                                   │ HTTP Request (FormData / JSON)</w:t>
+        <w:t xml:space="preserve">                   └──────────────────┬────────────────────────┘</w:t>
         <w:br/>
-        <w:t xml:space="preserve">                                   ▼</w:t>
+        <w:t xml:space="preserve">                                      │ HTTP Request (FormData / JSON)</w:t>
         <w:br/>
-        <w:t xml:space="preserve">               ┌────────────────────────────────────────┐</w:t>
+        <w:t xml:space="preserve">                                      ▼</w:t>
         <w:br/>
-        <w:t xml:space="preserve">               │     Backend Core API (FastAPI)         │</w:t>
+        <w:t xml:space="preserve">                  ┌────────────────────────────────────────┐</w:t>
         <w:br/>
-        <w:t xml:space="preserve">               │  - CORS Middleware / Async Handler     │</w:t>
+        <w:t xml:space="preserve">                  │     Backend Core API (FastAPI)         │</w:t>
         <w:br/>
-        <w:t xml:space="preserve">               │  - Data Validation / Temp Image Clean  │</w:t>
+        <w:t xml:space="preserve">                  │  - CORS Middleware / Async Handler     │</w:t>
         <w:br/>
-        <w:t xml:space="preserve">               └───────────────────┬────────────────────┘</w:t>
+        <w:t xml:space="preserve">                  │  - Firebase Auth Exchange &amp; JWT Token  │</w:t>
         <w:br/>
-        <w:t xml:space="preserve">                                   │</w:t>
+        <w:t xml:space="preserve">                  │  - Data Validation / Temp Image Clean  │</w:t>
         <w:br/>
-        <w:t xml:space="preserve">                    ┌──────────────┴──────────────┐</w:t>
+        <w:t xml:space="preserve">                  └───────────────────┬────────────────────┘</w:t>
         <w:br/>
-        <w:t xml:space="preserve">                    ▼                             ▼</w:t>
+        <w:t xml:space="preserve">                                      │</w:t>
         <w:br/>
-        <w:t xml:space="preserve">   ┌──────────────────────────────┐ ┌──────────────────────────────┐</w:t>
+        <w:t xml:space="preserve">                       ┌──────────────┴──────────────┐</w:t>
         <w:br/>
-        <w:t xml:space="preserve">   │ AI Vision Engine             │ │ TCM Fusion Pipeline          │</w:t>
+        <w:t xml:space="preserve">                       ▼                             ▼</w:t>
         <w:br/>
-        <w:t xml:space="preserve">   │ - Cloud VLM (Qwen3-VL-32B)   │ │ - Synonym Normalization      │</w:t>
+        <w:t xml:space="preserve">      ┌──────────────────────────────┐ ┌──────────────────────────────┐</w:t>
         <w:br/>
-        <w:t xml:space="preserve">   │ - Requesty / Ollama Fallback │ │ - Intersection &amp; IDF Scoring │</w:t>
+        <w:t xml:space="preserve">      │ AI Vision Engine             │ │ TCM Fusion Pipeline          │</w:t>
         <w:br/>
-        <w:t xml:space="preserve">   └──────────────┬───────────────┘ │ - Clinical Gatekeeper        │</w:t>
+        <w:t xml:space="preserve">      │ - Cloud VLM (Qwen3-VL-32B)   │ │ - Synonym Normalization      │</w:t>
         <w:br/>
-        <w:t xml:space="preserve">                  │                 └──────────────┬───────────────┘</w:t>
+        <w:t xml:space="preserve">      │ - Requesty / Ollama Fallback │ │ - Intersection &amp; IDF Scoring │</w:t>
         <w:br/>
-        <w:t xml:space="preserve">                  │                                │</w:t>
+        <w:t xml:space="preserve">      └──────────────┬───────────────┘ │ - Clinical Gatekeeper        │</w:t>
         <w:br/>
-        <w:t xml:space="preserve">                  └────────────────┬───────────────┘</w:t>
+        <w:t xml:space="preserve">                     │                 └──────────────┬───────────────┘</w:t>
         <w:br/>
-        <w:t xml:space="preserve">                                   ▼</w:t>
+        <w:t xml:space="preserve">                     │                                │</w:t>
         <w:br/>
-        <w:t xml:space="preserve">               ┌────────────────────────────────────────┐</w:t>
+        <w:t xml:space="preserve">                     └────────────────┬───────────────┘</w:t>
         <w:br/>
-        <w:t xml:space="preserve">               │   Graph Database (Neo4j Aura Cloud)    │</w:t>
+        <w:t xml:space="preserve">                                      ▼</w:t>
         <w:br/>
-        <w:t xml:space="preserve">               │  - 6 Entity Classes / Cypher Engine    │</w:t>
+        <w:t xml:space="preserve">                  ┌────────────────────────────────────────┐</w:t>
         <w:br/>
-        <w:t xml:space="preserve">               │  - Graph RAG Subgraph Retrieval        │</w:t>
+        <w:t xml:space="preserve">                  │   Graph Database (Neo4j Aura Cloud)    │</w:t>
         <w:br/>
-        <w:t xml:space="preserve">               └────────────────────────────────────────┘</w:t>
+        <w:t xml:space="preserve">                  │  - 6 Entity Classes / Cypher Engine    │</w:t>
+        <w:br/>
+        <w:t xml:space="preserve">                  │  - Graph RAG Subgraph Retrieval        │</w:t>
+        <w:br/>
+        <w:t xml:space="preserve">                  └────────────────────────────────────────┘</w:t>
       </w:r>
     </w:p>
     <w:p>
       <w:pPr>
+        <w:pStyle w:val="Heading2"/>
         <w:spacing w:before="240" w:after="80"/>
       </w:pPr>
       <w:r>
@@ -2200,6 +3117,90 @@
         <w:rPr>
           <w:b/>
         </w:rPr>
+        <w:t>Ứng dụng Di động (Mobile App - `DongY`):</w:t>
+      </w:r>
+      <w:r/>
+    </w:p>
+    <w:p>
+      <w:pPr>
+        <w:pStyle w:val="ListBullet"/>
+        <w:spacing w:before="40" w:after="40"/>
+      </w:pPr>
+      <w:r/>
+      <w:r>
+        <w:rPr>
+          <w:b/>
+        </w:rPr>
+        <w:t>Framework:</w:t>
+      </w:r>
+      <w:r>
+        <w:t xml:space="preserve"> React Native CLI 0.86, React 19, TypeScript 5.8.</w:t>
+      </w:r>
+    </w:p>
+    <w:p>
+      <w:pPr>
+        <w:pStyle w:val="ListBullet"/>
+        <w:spacing w:before="40" w:after="40"/>
+      </w:pPr>
+      <w:r/>
+      <w:r>
+        <w:rPr>
+          <w:rFonts w:ascii="Consolas" w:hAnsi="Consolas"/>
+          <w:color w:val="0F766E"/>
+          <w:sz w:val="20"/>
+        </w:rPr>
+        <w:t>react-native-image-picker</w:t>
+      </w:r>
+      <w:r>
+        <w:t>: Thao tác trực tiếp với Camera Native &amp; Thư viện ảnh thiết bị.</w:t>
+      </w:r>
+    </w:p>
+    <w:p>
+      <w:pPr>
+        <w:pStyle w:val="ListBullet"/>
+        <w:spacing w:before="40" w:after="40"/>
+      </w:pPr>
+      <w:r/>
+      <w:r>
+        <w:rPr>
+          <w:rFonts w:ascii="Consolas" w:hAnsi="Consolas"/>
+          <w:color w:val="0F766E"/>
+          <w:sz w:val="20"/>
+        </w:rPr>
+        <w:t>firebase</w:t>
+      </w:r>
+      <w:r>
+        <w:t>: Tích hợp Firebase Auth quản lý đăng nhập/đăng ký/quên mật khẩu.</w:t>
+      </w:r>
+    </w:p>
+    <w:p>
+      <w:pPr>
+        <w:pStyle w:val="ListBullet"/>
+        <w:spacing w:before="40" w:after="40"/>
+      </w:pPr>
+      <w:r/>
+      <w:r>
+        <w:rPr>
+          <w:rFonts w:ascii="Consolas" w:hAnsi="Consolas"/>
+          <w:color w:val="0F766E"/>
+          <w:sz w:val="20"/>
+        </w:rPr>
+        <w:t>react-native-safe-area-context</w:t>
+      </w:r>
+      <w:r>
+        <w:t>: Tối ưu hiển thị notch/tai thỏ trên các dòng điện thoại di động mới.</w:t>
+      </w:r>
+    </w:p>
+    <w:p>
+      <w:pPr>
+        <w:pStyle w:val="ListNumber"/>
+        <w:spacing w:before="40" w:after="40"/>
+      </w:pPr>
+      <w:r/>
+      <w:r>
+        <w:rPr>
+          <w:b/>
+        </w:rPr>
         <w:t>Engine AI (Cloud &amp; Local):</w:t>
       </w:r>
       <w:r/>
@@ -2219,7 +3220,7 @@
         <w:t>httpx</w:t>
       </w:r>
       <w:r>
-        <w:t>: Thư viện Client HTTP bất đồng bộ tốc độ cao, hỗ trợ gọi request API DashScope và Requesty Router.</w:t>
+        <w:t>: Client HTTP bất đồng bộ tốc độ cao, hỗ trợ gọi request API DashScope và Requesty Router.</w:t>
       </w:r>
     </w:p>
     <w:p>
@@ -2237,7 +3238,7 @@
         <w:t>Pillow (PIL)</w:t>
       </w:r>
       <w:r>
-        <w:t>: Xử lý hình ảnh, resize tự động cạnh dài ảnh về 1280px (</w:t>
+        <w:t>: Nén cạnh dài ảnh về 1280px (</w:t>
       </w:r>
       <w:r>
         <w:rPr>
@@ -2248,7 +3249,7 @@
         <w:t>_MAX_IMAGE_EDGE</w:t>
       </w:r>
       <w:r>
-        <w:t>) để giảm payload truyền qua mạng mà vẫn giữ nguyên chi tiết lâm sàng.</w:t>
+        <w:t>) giảm payload truyền tải qua di động.</w:t>
       </w:r>
     </w:p>
     <w:p>
@@ -2320,7 +3321,7 @@
         <w:t>FastAPI &amp; Uvicorn</w:t>
       </w:r>
       <w:r>
-        <w:t>: Khung ứng dụng Web RestAPI bất đồng bộ, xử lý Multipart Form-data khi người dùng tải ảnh mặt/lưỡi.</w:t>
+        <w:t>: Khung ứng dụng Web RestAPI bất đồng bộ, xử lý Multipart Form-data khi ứng dụng di động gửi ảnh.</w:t>
       </w:r>
     </w:p>
     <w:p>
@@ -2338,7 +3339,7 @@
         <w:t>neo4j</w:t>
       </w:r>
       <w:r>
-        <w:t xml:space="preserve">: Driver kết nối chính thức đến Neo4j Aura Cloud, được tối ưu cấu hình kết nối SSL </w:t>
+        <w:t xml:space="preserve">: Driver kết nối chính thức đến Neo4j Aura Cloud với SSL </w:t>
       </w:r>
       <w:r>
         <w:rPr>
@@ -2349,79 +3350,7 @@
         <w:t>keep_alive</w:t>
       </w:r>
       <w:r>
-        <w:t xml:space="preserve"> và </w:t>
-      </w:r>
-      <w:r>
-        <w:rPr>
-          <w:rFonts w:ascii="Consolas" w:hAnsi="Consolas"/>
-          <w:color w:val="0F766E"/>
-          <w:sz w:val="20"/>
-        </w:rPr>
-        <w:t>max_connection_lifetime</w:t>
-      </w:r>
-      <w:r>
         <w:t>.</w:t>
-      </w:r>
-    </w:p>
-    <w:p>
-      <w:pPr>
-        <w:pStyle w:val="ListNumber"/>
-        <w:spacing w:before="40" w:after="40"/>
-      </w:pPr>
-      <w:r/>
-      <w:r>
-        <w:rPr>
-          <w:b/>
-        </w:rPr>
-        <w:t>Lõi Xử lý Ngôn ngữ &amp; Đồ thị (`src/fusion_pipeline.py`):</w:t>
-      </w:r>
-      <w:r/>
-    </w:p>
-    <w:p>
-      <w:pPr>
-        <w:pStyle w:val="ListBullet"/>
-        <w:spacing w:before="40" w:after="40"/>
-      </w:pPr>
-      <w:r/>
-      <w:r>
-        <w:rPr>
-          <w:rFonts w:ascii="Consolas" w:hAnsi="Consolas"/>
-          <w:color w:val="0F766E"/>
-          <w:sz w:val="20"/>
-        </w:rPr>
-        <w:t>pandas &amp; numpy</w:t>
-      </w:r>
-      <w:r>
-        <w:t>: Xử lý dữ liệu bảng ma trận triệu chứng - hội chứng.</w:t>
-      </w:r>
-    </w:p>
-    <w:p>
-      <w:pPr>
-        <w:pStyle w:val="ListBullet"/>
-        <w:spacing w:before="40" w:after="40"/>
-      </w:pPr>
-      <w:r/>
-      <w:r>
-        <w:rPr>
-          <w:rFonts w:ascii="Consolas" w:hAnsi="Consolas"/>
-          <w:color w:val="0F766E"/>
-          <w:sz w:val="20"/>
-        </w:rPr>
-        <w:t>unicodedata &amp; re</w:t>
-      </w:r>
-      <w:r>
-        <w:t>: Chuẩn hóa xâu ký tự, loại bỏ toàn bộ chữ Hán/Cyrillic rác và bỏ dấu thanh (</w:t>
-      </w:r>
-      <w:r>
-        <w:rPr>
-          <w:rFonts w:ascii="Consolas" w:hAnsi="Consolas"/>
-          <w:color w:val="0F766E"/>
-          <w:sz w:val="20"/>
-        </w:rPr>
-        <w:t>_fold_vn</w:t>
-      </w:r>
-      <w:r>
-        <w:t>) phục vụ so khớp mờ.</w:t>
       </w:r>
     </w:p>
     <w:p>
@@ -2453,15 +3382,8 @@
         <w:t>TailwindCSS</w:t>
       </w:r>
       <w:r>
-        <w:t>: Thiết kế giao diện hiện đại, tối ưu trải nghiệm người dùng trên cả máy tính và điện thoại.</w:t>
-      </w:r>
-    </w:p>
-    <w:p>
-      <w:pPr>
-        <w:pStyle w:val="ListBullet"/>
-        <w:spacing w:before="40" w:after="40"/>
-      </w:pPr>
-      <w:r/>
+        <w:t xml:space="preserve"> &amp; </w:t>
+      </w:r>
       <w:r>
         <w:rPr>
           <w:rFonts w:ascii="Consolas" w:hAnsi="Consolas"/>
@@ -2471,25 +3393,7 @@
         <w:t>Vis-Network JS</w:t>
       </w:r>
       <w:r>
-        <w:t>: Dựng đồ thị mạng lưới liên kết thực thể 2D tương tác trực tiếp (kéo thả, zoom node) ngay trong khung chat.</w:t>
-      </w:r>
-    </w:p>
-    <w:p>
-      <w:pPr>
-        <w:pStyle w:val="ListBullet"/>
-        <w:spacing w:before="40" w:after="40"/>
-      </w:pPr>
-      <w:r/>
-      <w:r>
-        <w:rPr>
-          <w:rFonts w:ascii="Consolas" w:hAnsi="Consolas"/>
-          <w:color w:val="0F766E"/>
-          <w:sz w:val="20"/>
-        </w:rPr>
-        <w:t>Marked JS</w:t>
-      </w:r>
-      <w:r>
-        <w:t>: Render văn bản Markdown báo cáo biện chứng 5 phần với định dạng sắc nét.</w:t>
+        <w:t>: Dựng đồ thị mạng lưới liên kết thực thể 2D tương tác trực tiếp.</w:t>
       </w:r>
     </w:p>
     <w:p>
@@ -2505,6 +3409,7 @@
     </w:p>
     <w:p>
       <w:pPr>
+        <w:pStyle w:val="Heading1"/>
         <w:spacing w:before="280" w:after="120"/>
       </w:pPr>
       <w:r>
@@ -2526,6 +3431,7 @@
     </w:p>
     <w:p>
       <w:pPr>
+        <w:pStyle w:val="Heading2"/>
         <w:spacing w:before="240" w:after="80"/>
       </w:pPr>
       <w:r>
@@ -2648,11 +3554,12 @@
         <w:t>Nghiên cứu Kiến trúc Graph RAG:</w:t>
       </w:r>
       <w:r>
-        <w:t xml:space="preserve"> Phân tích mô hình kết hợp giữa CSDL Đồ thị (Graph DB) và Mô hình Ngôn ngữ lớn (LLM) để giải quyết bài toán suy luận y khoa có giải thích và triệt tiêu ảo giác.</w:t>
+        <w:t xml:space="preserve"> Phân tích mô hình kết hợp giữa CSDL Đồ thị (Graph DB) và Mô hình Ngôn ngữ lớn (LLM) để giải quyết bài toán suy luận y khoa có giải thích.</w:t>
       </w:r>
     </w:p>
     <w:p>
       <w:pPr>
+        <w:pStyle w:val="Heading2"/>
         <w:spacing w:before="240" w:after="80"/>
       </w:pPr>
       <w:r>
@@ -2718,55 +3625,7 @@
     </w:p>
     <w:p>
       <w:pPr>
-        <w:pStyle w:val="ListBullet"/>
-        <w:spacing w:before="40" w:after="40"/>
-      </w:pPr>
-      <w:r/>
-      <w:r>
-        <w:rPr>
-          <w:b/>
-        </w:rPr>
-        <w:t>Xây dựng Từ điển Đồng nghĩa:</w:t>
-      </w:r>
-      <w:r>
-        <w:t xml:space="preserve"> Tạo lập các file ánh xạ </w:t>
-      </w:r>
-      <w:r>
-        <w:rPr>
-          <w:rFonts w:ascii="Consolas" w:hAnsi="Consolas"/>
-          <w:color w:val="0F766E"/>
-          <w:sz w:val="20"/>
-        </w:rPr>
-        <w:t>data/mapping/face_to_syndrome.json</w:t>
-      </w:r>
-      <w:r>
-        <w:t xml:space="preserve">, </w:t>
-      </w:r>
-      <w:r>
-        <w:rPr>
-          <w:rFonts w:ascii="Consolas" w:hAnsi="Consolas"/>
-          <w:color w:val="0F766E"/>
-          <w:sz w:val="20"/>
-        </w:rPr>
-        <w:t>tongue_to_syndrome.json</w:t>
-      </w:r>
-      <w:r>
-        <w:t xml:space="preserve"> và </w:t>
-      </w:r>
-      <w:r>
-        <w:rPr>
-          <w:rFonts w:ascii="Consolas" w:hAnsi="Consolas"/>
-          <w:color w:val="0F766E"/>
-          <w:sz w:val="20"/>
-        </w:rPr>
-        <w:t>data/symptom_concepts.json</w:t>
-      </w:r>
-      <w:r>
-        <w:t>.</w:t>
-      </w:r>
-    </w:p>
-    <w:p>
-      <w:pPr>
+        <w:pStyle w:val="Heading2"/>
         <w:spacing w:before="240" w:after="80"/>
       </w:pPr>
       <w:r>
@@ -2832,33 +3691,7 @@
     </w:p>
     <w:p>
       <w:pPr>
-        <w:pStyle w:val="ListBullet"/>
-        <w:spacing w:before="40" w:after="40"/>
-      </w:pPr>
-      <w:r/>
-      <w:r>
-        <w:rPr>
-          <w:b/>
-        </w:rPr>
-        <w:t>Xử lý Ảnh Lâm sàng:</w:t>
-      </w:r>
-      <w:r>
-        <w:t xml:space="preserve"> Xây dựng module tự động nén kích thước cạnh dài ảnh (</w:t>
-      </w:r>
-      <w:r>
-        <w:rPr>
-          <w:rFonts w:ascii="Consolas" w:hAnsi="Consolas"/>
-          <w:color w:val="0F766E"/>
-          <w:sz w:val="20"/>
-        </w:rPr>
-        <w:t>_MAX_IMAGE_EDGE = 1280</w:t>
-      </w:r>
-      <w:r>
-        <w:t>) và xử lý triệt để lỗi khóa file tạm (File Locking) trên hệ điều hành Windows khi đọc ảnh qua Pillow.</w:t>
-      </w:r>
-    </w:p>
-    <w:p>
-      <w:pPr>
+        <w:pStyle w:val="Heading2"/>
         <w:spacing w:before="240" w:after="80"/>
       </w:pPr>
       <w:r>
@@ -2921,7 +3754,7 @@
         <w:t>toLower</w:t>
       </w:r>
       <w:r>
-        <w:t>), khắc phục hoàn toàn lỗi rớt từ khóa triệu chứng 1 âm tiết (như "nôn", "ho", "đau").</w:t>
+        <w:t>), khắc phục hoàn toàn lỗi rớt từ khóa triệu chứng 1 âm tiết.</w:t>
       </w:r>
     </w:p>
     <w:p>
@@ -2948,38 +3781,12 @@
         <w:t>_normalize_symptoms</w:t>
       </w:r>
       <w:r>
-        <w:t xml:space="preserve"> tự động quy đổi các tên triệu chứng đồng nghĩa (ví dụ: </w:t>
-      </w:r>
-      <w:r>
-        <w:rPr>
-          <w:i/>
-        </w:rPr>
-        <w:t>diện hồng $\rightarrow$ mặt đỏ</w:t>
-      </w:r>
-      <w:r>
-        <w:t xml:space="preserve">, </w:t>
-      </w:r>
-      <w:r>
-        <w:rPr>
-          <w:i/>
-        </w:rPr>
-        <w:t>huyễn vựng $\rightarrow$ chóng mặt</w:t>
-      </w:r>
-      <w:r>
-        <w:t xml:space="preserve">, </w:t>
-      </w:r>
-      <w:r>
-        <w:rPr>
-          <w:i/>
-        </w:rPr>
-        <w:t>lưỡi hằn răng $\rightarrow$ rìa lưỡi có hằn răng</w:t>
-      </w:r>
-      <w:r>
-        <w:t>).</w:t>
+        <w:t xml:space="preserve"> tự động quy đổi các tên triệu chứng đồng nghĩa.</w:t>
       </w:r>
     </w:p>
     <w:p>
       <w:pPr>
+        <w:pStyle w:val="Heading2"/>
         <w:spacing w:before="240" w:after="80"/>
       </w:pPr>
       <w:r>
@@ -3004,7 +3811,18 @@
         <w:t>Xây dựng Lõi Hợp nhất (`TCMFusionPipeline`):</w:t>
       </w:r>
       <w:r>
-        <w:t xml:space="preserve"> Phát triển module trung tâm [src/fusion_pipeline.py](file:///C:/Users/hoang/TTDN/TCM_System/src/fusion_pipeline.py) phối hợp dữ liệu Vọng chẩn, Vấn chẩn và CSDL Neo4j.</w:t>
+        <w:t xml:space="preserve"> Phát triển module trung tâm </w:t>
+      </w:r>
+      <w:r>
+        <w:rPr>
+          <w:rFonts w:ascii="Consolas" w:hAnsi="Consolas"/>
+          <w:color w:val="0F766E"/>
+          <w:sz w:val="20"/>
+        </w:rPr>
+        <w:t>src/fusion_pipeline.py</w:t>
+      </w:r>
+      <w:r>
+        <w:t xml:space="preserve"> phối hợp dữ liệu Vọng chẩn, Vấn chẩn và CSDL Neo4j.</w:t>
       </w:r>
     </w:p>
     <w:p>
@@ -3020,7 +3838,7 @@
         <w:t>Thuật toán Đánh giá Trọng số IDF (Intersection Scoring):</w:t>
       </w:r>
       <w:r>
-        <w:t xml:space="preserve"> Triển khai công thức tính điểm IDF Grounding Score cho từng nút hội chứng, loại bỏ hiệu ứng "Cạm bẫy tập hợp Hợp" để chốt chính xác Hội chứng Cốt lõi.</w:t>
+        <w:t xml:space="preserve"> Triển khai công thức tính điểm IDF Grounding Score cho từng nút hội chứng, loại bỏ hiệu ứng "Cạm bẫy tập hợp Hợp".</w:t>
       </w:r>
     </w:p>
     <w:p>
@@ -3036,56 +3854,12 @@
         <w:t>Định dạng Báo cáo 5 Phần:</w:t>
       </w:r>
       <w:r>
-        <w:t xml:space="preserve"> Chuẩn hóa đầu ra báo cáo chẩn đoán gồm 5 phần chi tiết: </w:t>
-      </w:r>
-      <w:r>
-        <w:rPr>
-          <w:i/>
-        </w:rPr>
-        <w:t>1. Tổng quan Chẩn đoán</w:t>
-      </w:r>
-      <w:r>
-        <w:t xml:space="preserve">, </w:t>
-      </w:r>
-      <w:r>
-        <w:rPr>
-          <w:i/>
-        </w:rPr>
-        <w:t>2. Định vị Bát Cương</w:t>
-      </w:r>
-      <w:r>
-        <w:t xml:space="preserve">, </w:t>
-      </w:r>
-      <w:r>
-        <w:rPr>
-          <w:i/>
-        </w:rPr>
-        <w:t>3. Phân tích Cơ chế Gốc (Bản Hư)</w:t>
-      </w:r>
-      <w:r>
-        <w:t xml:space="preserve">, </w:t>
-      </w:r>
-      <w:r>
-        <w:rPr>
-          <w:i/>
-        </w:rPr>
-        <w:t>4. Phân tích Cơ chế Ngọn (Tiêu Thực &amp; Cảnh báo Lâm sàng)</w:t>
-      </w:r>
-      <w:r>
-        <w:t xml:space="preserve">, </w:t>
-      </w:r>
-      <w:r>
-        <w:rPr>
-          <w:i/>
-        </w:rPr>
-        <w:t>5. Pháp trị &amp; Bài thuốc + Cảnh báo An toàn Dược liệu</w:t>
-      </w:r>
-      <w:r>
-        <w:t>.</w:t>
+        <w:t xml:space="preserve"> Chuẩn hóa đầu ra báo cáo chẩn đoán gồm 5 phần chi tiết chuẩn y lý Đông y.</w:t>
       </w:r>
     </w:p>
     <w:p>
       <w:pPr>
+        <w:pStyle w:val="Heading2"/>
         <w:spacing w:before="240" w:after="80"/>
       </w:pPr>
       <w:r>
@@ -3094,7 +3868,86 @@
           <w:color w:val="0D9488"/>
           <w:sz w:val="26"/>
         </w:rPr>
-        <w:t>Tuần 6: Xây dựng Ứng dụng Web App Visual Chatbot &amp; Đồ thị Tương tác</w:t>
+        <w:t>Tuần 6: Xây dựng Ứng dụng Di động React Native (`DongY` App) &amp; Web UI</w:t>
+      </w:r>
+    </w:p>
+    <w:p>
+      <w:pPr>
+        <w:pStyle w:val="ListBullet"/>
+        <w:spacing w:before="40" w:after="40"/>
+      </w:pPr>
+      <w:r/>
+      <w:r>
+        <w:rPr>
+          <w:b/>
+        </w:rPr>
+        <w:t>Phát triển App Di động Native (`DongY`):</w:t>
+      </w:r>
+      <w:r>
+        <w:t xml:space="preserve"> Xây dựng ứng dụng di động bằng React Native CLI &amp; TypeScript, tích hợp </w:t>
+      </w:r>
+      <w:r>
+        <w:rPr>
+          <w:rFonts w:ascii="Consolas" w:hAnsi="Consolas"/>
+          <w:color w:val="0F766E"/>
+          <w:sz w:val="20"/>
+        </w:rPr>
+        <w:t>react-native-image-picker</w:t>
+      </w:r>
+      <w:r>
+        <w:t xml:space="preserve"> chụp ảnh Vọng chẩn từ Camera native điện thoại.</w:t>
+      </w:r>
+    </w:p>
+    <w:p>
+      <w:pPr>
+        <w:pStyle w:val="ListBullet"/>
+        <w:spacing w:before="40" w:after="40"/>
+      </w:pPr>
+      <w:r/>
+      <w:r>
+        <w:rPr>
+          <w:b/>
+        </w:rPr>
+        <w:t>Tích hợp Firebase Auth &amp; Phân quyền:</w:t>
+      </w:r>
+      <w:r>
+        <w:t xml:space="preserve"> Xây dựng luồng Đăng nhập/Đăng ký/Quên mật khẩu bằng Firebase Auth, tự động trao đổi ID Token với Backend lấy JWT Token và Phân quyền Vai trò (</w:t>
+      </w:r>
+      <w:r>
+        <w:rPr>
+          <w:b/>
+        </w:rPr>
+        <w:t>Bác sĩ / Bệnh nhân</w:t>
+      </w:r>
+      <w:r>
+        <w:t>).</w:t>
+      </w:r>
+    </w:p>
+    <w:p>
+      <w:pPr>
+        <w:pStyle w:val="ListBullet"/>
+        <w:spacing w:before="40" w:after="40"/>
+      </w:pPr>
+      <w:r/>
+      <w:r>
+        <w:rPr>
+          <w:b/>
+        </w:rPr>
+        <w:t>Kết nối Ngrok Tunnel &amp; API Server:</w:t>
+      </w:r>
+      <w:r>
+        <w:t xml:space="preserve"> Cấu hình tự động gửi Header </w:t>
+      </w:r>
+      <w:r>
+        <w:rPr>
+          <w:rFonts w:ascii="Consolas" w:hAnsi="Consolas"/>
+          <w:color w:val="0F766E"/>
+          <w:sz w:val="20"/>
+        </w:rPr>
+        <w:t>ngrok-skip-browser-warning: true</w:t>
+      </w:r>
+      <w:r>
+        <w:t xml:space="preserve"> trong React Native app để giao tiếp với Backend FastAPI qua Internet.</w:t>
       </w:r>
     </w:p>
     <w:p>
@@ -3110,61 +3963,12 @@
         <w:t>Thiết kế Giao diện Web App (`index.html`):</w:t>
       </w:r>
       <w:r>
-        <w:t xml:space="preserve"> Phát triển ứng dụng Web phản hồi nhanh sử dụng HTML5, Vanilla JavaScript và TailwindCSS.</w:t>
+        <w:t xml:space="preserve"> Thiết kế Web UI phản hồi nhanh với TailwindCSS và Vis-Network JS dựng đồ thị mạng lưới tương tác 2D.</w:t>
       </w:r>
     </w:p>
     <w:p>
       <w:pPr>
-        <w:pStyle w:val="ListBullet"/>
-        <w:spacing w:before="40" w:after="40"/>
-      </w:pPr>
-      <w:r/>
-      <w:r>
-        <w:rPr>
-          <w:b/>
-        </w:rPr>
-        <w:t>Tích hợp Form Vấn chẩn 10 Trường:</w:t>
-      </w:r>
-      <w:r>
-        <w:t xml:space="preserve"> Xây dựng bộ biểu mẫu thu thập 10 trường </w:t>
-      </w:r>
-      <w:r>
-        <w:rPr>
-          <w:i/>
-        </w:rPr>
-        <w:t>Vấn chẩn chi tiết</w:t>
-      </w:r>
-      <w:r>
-        <w:t xml:space="preserve"> kết hợp vùng tải ảnh </w:t>
-      </w:r>
-      <w:r>
-        <w:rPr>
-          <w:i/>
-        </w:rPr>
-        <w:t>Vọng chẩn</w:t>
-      </w:r>
-      <w:r>
-        <w:t xml:space="preserve"> (Mặt &amp; Lưỡi).</w:t>
-      </w:r>
-    </w:p>
-    <w:p>
-      <w:pPr>
-        <w:pStyle w:val="ListBullet"/>
-        <w:spacing w:before="40" w:after="40"/>
-      </w:pPr>
-      <w:r/>
-      <w:r>
-        <w:rPr>
-          <w:b/>
-        </w:rPr>
-        <w:t>Tích hợp Vis-Network JS:</w:t>
-      </w:r>
-      <w:r>
-        <w:t xml:space="preserve"> Xây dựng tính năng tự động dựng đồ thị liên kết thực thể 2D trực quan ngay bên dưới báo cáo chẩn đoán, cho phép người dùng nhấp kéo node để theo dõi đường đi từ Triệu chứng $\rightarrow$ Hội chứng $\rightarrow$ Bài thuốc $\rightarrow$ Vị thuốc.</w:t>
-      </w:r>
-    </w:p>
-    <w:p>
-      <w:pPr>
+        <w:pStyle w:val="Heading2"/>
         <w:spacing w:before="240" w:after="80"/>
       </w:pPr>
       <w:r>
@@ -3186,10 +3990,10 @@
         <w:rPr>
           <w:b/>
         </w:rPr>
-        <w:t>Thực nghiệm Ca Lâm sàng:</w:t>
-      </w:r>
-      <w:r>
-        <w:t xml:space="preserve"> Nhập và kiểm thử hàng loạt case study thực tế:</w:t>
+        <w:t>Thực nghiệm Ca Lâm sàng trên Di động &amp; Web:</w:t>
+      </w:r>
+      <w:r>
+        <w:t xml:space="preserve"> Kiểm thử hàng loạt case study thực tế (Vàng da sơ sinh, Suy nhược da tái, Đau lưng Thận dương hư cấp tính).</w:t>
       </w:r>
     </w:p>
     <w:p>
@@ -3197,99 +4001,24 @@
         <w:pStyle w:val="ListBullet"/>
         <w:spacing w:before="40" w:after="40"/>
       </w:pPr>
-      <w:r>
-        <w:t xml:space="preserve">Trẻ sơ sinh bị bệnh gan/mật $\rightarrow$ Nhận diện chuẩn </w:t>
-      </w:r>
+      <w:r/>
       <w:r>
         <w:rPr>
-          <w:rFonts w:ascii="Consolas" w:hAnsi="Consolas"/>
-          <w:color w:val="0F766E"/>
-          <w:sz w:val="20"/>
+          <w:b/>
         </w:rPr>
-        <w:t>sac_mat: vàng úa</w:t>
-      </w:r>
-      <w:r>
-        <w:t>.</w:t>
-      </w:r>
-    </w:p>
-    <w:p>
-      <w:pPr>
-        <w:pStyle w:val="ListBullet"/>
-        <w:spacing w:before="40" w:after="40"/>
-      </w:pPr>
-      <w:r>
-        <w:t xml:space="preserve">Bệnh nhân nữ da tái gầy suy nhược $\rightarrow$ Nhận diện chuẩn </w:t>
-      </w:r>
-      <w:r>
-        <w:rPr>
-          <w:rFonts w:ascii="Consolas" w:hAnsi="Consolas"/>
-          <w:color w:val="0F766E"/>
-          <w:sz w:val="20"/>
-        </w:rPr>
-        <w:t>sac_mat: trắng nhợt</w:t>
-      </w:r>
-      <w:r>
-        <w:t xml:space="preserve"> + </w:t>
-      </w:r>
-      <w:r>
-        <w:rPr>
-          <w:rFonts w:ascii="Consolas" w:hAnsi="Consolas"/>
-          <w:color w:val="0F766E"/>
-          <w:sz w:val="20"/>
-        </w:rPr>
-        <w:t>quang_tham: có</w:t>
-      </w:r>
-      <w:r>
-        <w:t>.</w:t>
-      </w:r>
-    </w:p>
-    <w:p>
-      <w:pPr>
-        <w:pStyle w:val="ListBullet"/>
-        <w:spacing w:before="40" w:after="40"/>
-      </w:pPr>
-      <w:r>
-        <w:t xml:space="preserve">Nam giới da bình thường có mụn nhỏ $\rightarrow$ Nhận diện chuẩn </w:t>
-      </w:r>
-      <w:r>
-        <w:rPr>
-          <w:rFonts w:ascii="Consolas" w:hAnsi="Consolas"/>
-          <w:color w:val="0F766E"/>
-          <w:sz w:val="20"/>
-        </w:rPr>
-        <w:t>sac_mat: hồng hào bình thường</w:t>
-      </w:r>
-      <w:r>
-        <w:t>, loại bỏ hoàn toàn nhầm lẫn phát ban đỏ (</w:t>
-      </w:r>
-      <w:r>
-        <w:rPr>
-          <w:rFonts w:ascii="Consolas" w:hAnsi="Consolas"/>
-          <w:color w:val="0F766E"/>
-          <w:sz w:val="20"/>
-        </w:rPr>
-        <w:t>ban_do: không</w:t>
-      </w:r>
-      <w:r>
-        <w:t>).</w:t>
-      </w:r>
-    </w:p>
-    <w:p>
-      <w:pPr>
-        <w:pStyle w:val="ListBullet"/>
-        <w:spacing w:before="40" w:after="40"/>
-      </w:pPr>
-      <w:r>
-        <w:t xml:space="preserve">Ca bệnh </w:t>
+        <w:t>Xây dựng Cống Lọc An toàn Lâm sàng (Gatekeeper Engine):</w:t>
+      </w:r>
+      <w:r>
+        <w:t xml:space="preserve"> Tự động so sánh thời gian mắc bệnh (</w:t>
       </w:r>
       <w:r>
         <w:rPr>
           <w:i/>
         </w:rPr>
-        <w:t>Yêu thống - Thận dương hư</w:t>
-      </w:r>
-      <w:r>
-        <w:t xml:space="preserve"> cấp tính $\rightarrow$ Kích hoạt cảnh báo </w:t>
+        <w:t>Mới phát 1-2 ngày vs Hư chứng mạn tính</w:t>
+      </w:r>
+      <w:r>
+        <w:t>) để ngăn chặn việc dùng thuốc bổ quá sớm khi chưa giải tà khí (</w:t>
       </w:r>
       <w:r>
         <w:rPr>
@@ -3298,23 +4027,7 @@
         <w:t>"Bổ sớm lưu tà"</w:t>
       </w:r>
       <w:r>
-        <w:t>.</w:t>
-      </w:r>
-    </w:p>
-    <w:p>
-      <w:pPr>
-        <w:pStyle w:val="ListBullet"/>
-        <w:spacing w:before="40" w:after="40"/>
-      </w:pPr>
-      <w:r/>
-      <w:r>
-        <w:rPr>
-          <w:b/>
-        </w:rPr>
-        <w:t>Xây dựng Cống Lọc An toàn Lâm sàng (Gatekeeper Engine):</w:t>
-      </w:r>
-      <w:r>
-        <w:t xml:space="preserve"> Tự động so sánh thời gian mắc bệnh (Mới phát 1-2 ngày vs Hư chứng mạn tính) để ngăn chặn việc dùng thuốc bổ quá sớm khi chưa giải tà khí.</w:t>
+        <w:t>).</w:t>
       </w:r>
     </w:p>
     <w:p>
@@ -3353,6 +4066,7 @@
     </w:p>
     <w:p>
       <w:pPr>
+        <w:pStyle w:val="Heading2"/>
         <w:spacing w:before="240" w:after="80"/>
       </w:pPr>
       <w:r>
@@ -3410,7 +4124,7 @@
         <w:t>api.py</w:t>
       </w:r>
       <w:r>
-        <w:t xml:space="preserve">, </w:t>
+        <w:t>) và React Native Mobile App (</w:t>
       </w:r>
       <w:r>
         <w:rPr>
@@ -3418,7 +4132,7 @@
           <w:color w:val="0F766E"/>
           <w:sz w:val="20"/>
         </w:rPr>
-        <w:t>.env</w:t>
+        <w:t>DongY</w:t>
       </w:r>
       <w:r>
         <w:t>).</w:t>
@@ -3445,7 +4159,7 @@
           <w:color w:val="0F766E"/>
           <w:sz w:val="20"/>
         </w:rPr>
-        <w:t>https://github.com/hoangkv567-cyber/Claude-c-a-duy.git</w:t>
+        <w:t>https://github.com/Web-Media-AI/WM-Chatbot-XVQA.git</w:t>
       </w:r>
       <w:r>
         <w:t>.</w:t>
@@ -3480,6 +4194,7 @@
     </w:p>
     <w:p>
       <w:pPr>
+        <w:pStyle w:val="Heading1"/>
         <w:spacing w:before="280" w:after="120"/>
       </w:pPr>
       <w:r>
@@ -3493,6 +4208,7 @@
     </w:p>
     <w:p>
       <w:pPr>
+        <w:pStyle w:val="Heading2"/>
         <w:spacing w:before="240" w:after="80"/>
       </w:pPr>
       <w:r>
@@ -3501,7 +4217,7 @@
           <w:color w:val="0D9488"/>
           <w:sz w:val="26"/>
         </w:rPr>
-        <w:t>1. Thực thi Truy vấn Đồ thị Tri thức Neo4j (Cypher Code)</w:t>
+        <w:t>1. Mã Nguồn Xử lý Ứng dụng Di động React Native (`DongY/App.tsx`)</w:t>
       </w:r>
     </w:p>
     <w:p>
@@ -3509,7 +4225,148 @@
         <w:spacing w:before="40" w:after="80" w:line="276" w:lineRule="auto"/>
       </w:pPr>
       <w:r>
-        <w:t>Dữ liệu được truy xuất thông qua các câu lệnh Cypher tối ưu hóa so khớp mờ và tính toán tần suất liên kết:</w:t>
+        <w:t>Dưới đây là trích đoạn mã nguồn TypeScript thực tế trên ứng dụng di động xử lý chụp ảnh Vọng chẩn từ Camera và trao đổi ID Token Firebase với Backend:</w:t>
+      </w:r>
+    </w:p>
+    <w:p>
+      <w:pPr>
+        <w:spacing w:before="80" w:after="160"/>
+      </w:pPr>
+      <w:r>
+        <w:rPr>
+          <w:rFonts w:ascii="Consolas" w:hAnsi="Consolas"/>
+          <w:color w:val="1E293B"/>
+          <w:sz w:val="19"/>
+        </w:rPr>
+        <w:t>// Trích đoạn xử lý Chụp ảnh Vọng chẩn &amp; Gửi dữ liệu từ App React Native</w:t>
+        <w:br/>
+        <w:t>import { launchCamera, launchImageLibrary } from 'react-native-image-picker';</w:t>
+        <w:br/>
+        <w:t>import { auth } from './firebaseConfig';</w:t>
+        <w:br/>
+        <w:br/>
+        <w:t>// 1. Hàm chụp ảnh Vọng chẩn từ Camera Native</w:t>
+        <w:br/>
+        <w:t>const handleTakeFacePhoto = async () =&gt; {</w:t>
+        <w:br/>
+        <w:t xml:space="preserve">  const result = await launchCamera({</w:t>
+        <w:br/>
+        <w:t xml:space="preserve">    mediaType: 'photo',</w:t>
+        <w:br/>
+        <w:t xml:space="preserve">    quality: 0.8,</w:t>
+        <w:br/>
+        <w:t xml:space="preserve">    maxWidth: 1280,</w:t>
+        <w:br/>
+        <w:t xml:space="preserve">    maxHeight: 1280,</w:t>
+        <w:br/>
+        <w:t xml:space="preserve">  });</w:t>
+        <w:br/>
+        <w:t xml:space="preserve">  if (result.assets &amp;&amp; result.assets.length &gt; 0) {</w:t>
+        <w:br/>
+        <w:t xml:space="preserve">    setFaceImage(result.assets[0]);</w:t>
+        <w:br/>
+        <w:t xml:space="preserve">  }</w:t>
+        <w:br/>
+        <w:t>};</w:t>
+        <w:br/>
+        <w:br/>
+        <w:t>// 2. Hàm gửi chẩn đoán đa phương thức từ Mobile App lên FastAPI Server</w:t>
+        <w:br/>
+        <w:t>const handleDiagnose = async () =&gt; {</w:t>
+        <w:br/>
+        <w:t xml:space="preserve">  setIsLoading(true);</w:t>
+        <w:br/>
+        <w:t xml:space="preserve">  const formData = new FormData();</w:t>
+        <w:br/>
+        <w:t xml:space="preserve">  </w:t>
+        <w:br/>
+        <w:t xml:space="preserve">  formData.append('symptoms', symptoms);</w:t>
+        <w:br/>
+        <w:t xml:space="preserve">  formData.append('age', age);</w:t>
+        <w:br/>
+        <w:t xml:space="preserve">  formData.append('sex', sex);</w:t>
+        <w:br/>
+        <w:t xml:space="preserve">  formData.append('onset', onset);</w:t>
+        <w:br/>
+        <w:t xml:space="preserve">  formData.append('han_nhiet', hanNhiet);</w:t>
+        <w:br/>
+        <w:t xml:space="preserve">  formData.append('tieu_tien', tieuTien);</w:t>
+        <w:br/>
+        <w:t xml:space="preserve">  </w:t>
+        <w:br/>
+        <w:t xml:space="preserve">  if (faceImage) {</w:t>
+        <w:br/>
+        <w:t xml:space="preserve">    formData.append('face_image', {</w:t>
+        <w:br/>
+        <w:t xml:space="preserve">      uri: Platform.OS === 'android' ? faceImage.uri : faceImage.uri.replace('file://', ''),</w:t>
+        <w:br/>
+        <w:t xml:space="preserve">      type: faceImage.type || 'image/jpeg',</w:t>
+        <w:br/>
+        <w:t xml:space="preserve">      name: faceImage.fileName || 'face_image.jpg',</w:t>
+        <w:br/>
+        <w:t xml:space="preserve">    } as any);</w:t>
+        <w:br/>
+        <w:t xml:space="preserve">  }</w:t>
+        <w:br/>
+        <w:br/>
+        <w:t xml:space="preserve">  try {</w:t>
+        <w:br/>
+        <w:t xml:space="preserve">    const response = await fetch(`${apiUrl}/api/diagnose`, {</w:t>
+        <w:br/>
+        <w:t xml:space="preserve">      method: 'POST',</w:t>
+        <w:br/>
+        <w:t xml:space="preserve">      headers: {</w:t>
+        <w:br/>
+        <w:t xml:space="preserve">        'Authorization': `Bearer ${jwtToken}`,</w:t>
+        <w:br/>
+        <w:t xml:space="preserve">        'ngrok-skip-browser-warning': 'true',</w:t>
+        <w:br/>
+        <w:t xml:space="preserve">      },</w:t>
+        <w:br/>
+        <w:t xml:space="preserve">      body: formData,</w:t>
+        <w:br/>
+        <w:t xml:space="preserve">    });</w:t>
+        <w:br/>
+        <w:t xml:space="preserve">    const data = await response.json();</w:t>
+        <w:br/>
+        <w:t xml:space="preserve">    setResult(data);</w:t>
+        <w:br/>
+        <w:t xml:space="preserve">  } catch (error) {</w:t>
+        <w:br/>
+        <w:t xml:space="preserve">    Alert.alert('Lỗi kết nối', 'Không thể kết nối đến Máy chủ AI.');</w:t>
+        <w:br/>
+        <w:t xml:space="preserve">  } finally {</w:t>
+        <w:br/>
+        <w:t xml:space="preserve">    setIsLoading(false);</w:t>
+        <w:br/>
+        <w:t xml:space="preserve">  }</w:t>
+        <w:br/>
+        <w:t>};</w:t>
+      </w:r>
+    </w:p>
+    <w:p>
+      <w:pPr>
+        <w:spacing w:before="120" w:after="120"/>
+      </w:pPr>
+      <w:r>
+        <w:rPr>
+          <w:color w:val="CCFBF1"/>
+        </w:rPr>
+        <w:t>_________________________________________________________________________________</w:t>
+      </w:r>
+    </w:p>
+    <w:p>
+      <w:pPr>
+        <w:pStyle w:val="Heading2"/>
+        <w:spacing w:before="240" w:after="80"/>
+      </w:pPr>
+      <w:r>
+        <w:rPr>
+          <w:b/>
+          <w:color w:val="0D9488"/>
+          <w:sz w:val="26"/>
+        </w:rPr>
+        <w:t>2. Thực thi Truy vấn Đồ thị Tri thức Neo4j (Cypher Code)</w:t>
       </w:r>
     </w:p>
     <w:p>
@@ -3580,6 +4437,7 @@
     </w:p>
     <w:p>
       <w:pPr>
+        <w:pStyle w:val="Heading2"/>
         <w:spacing w:before="240" w:after="80"/>
       </w:pPr>
       <w:r>
@@ -3588,15 +4446,7 @@
           <w:color w:val="0D9488"/>
           <w:sz w:val="26"/>
         </w:rPr>
-        <w:t>2. Kết quả Chẩn đoán Lâm sàng Mẫu từ Hệ thống (System Diagnostic Output)</w:t>
-      </w:r>
-    </w:p>
-    <w:p>
-      <w:pPr>
-        <w:spacing w:before="40" w:after="80" w:line="276" w:lineRule="auto"/>
-      </w:pPr>
-      <w:r>
-        <w:t>Dưới đây là báo cáo biện chứng y khoa do hệ thống tự động sinh ra khi nhận ca bệnh lâm sàng đau lưng, mệt mỏi, tiểu đêm và sắc mặt tái nhợt:</w:t>
+        <w:t>3. Kết quả Chẩn đoán Lâm sàng Mẫu từ Hệ thống (System Diagnostic Output)</w:t>
       </w:r>
     </w:p>
     <w:p>
@@ -3636,11 +4486,9 @@
         <w:br/>
         <w:t xml:space="preserve">   - Dương khí ở Thận vốn có chức năng ôn hóa khí, thúc đẩy và kiểm soát sự chuyển hóa thủy dịch. Khi Thận dương bất túc, bàng quang mất quyền khai hợp điều độ, làm nước tiểu trong dài, tiểu nhiều và tiểu đêm.</w:t>
         <w:br/>
-        <w:t xml:space="preserve">   - Thắt lưng là phủ của Thận (Yêu vi Thận chi phủ), Thận dương hư không ôn dưỡng được kinh mạch vùng thắt lưng gây đau lưng.</w:t>
+        <w:t xml:space="preserve">   - Thắt lưng là phủ của Thận (Yêu vi Thận chi phủ), Thận dương hư không ôn dưỡng kinh mạch vùng thắt lưng gây đau lưng.</w:t>
         <w:br/>
         <w:t xml:space="preserve">   - Dương khí suy vi toàn thân mất nguồn sinh lực gây mệt mỏi; Vệ dương không cố nhiếp được tấu lý gây tự hãn (ra mồ hôi nhiều).</w:t>
-        <w:br/>
-        <w:t xml:space="preserve">   - Thanh dương bất thăng không nuôi dưỡng não tủy sinh chóng mặt. Tân dịch không được khí hóa dâng lên thượng tiêu gây cảm giác khát nước nhưng không kèm nhiệt chứng.</w:t>
         <w:br/>
         <w:br/>
         <w:t>4. PHÂN TÍCH CƠ CHẾ NGỌN (TIÊU THỰC &amp; CẢNH BÁO LÂM SÀNG):</w:t>
@@ -3674,6 +4522,7 @@
     </w:p>
     <w:p>
       <w:pPr>
+        <w:pStyle w:val="Heading1"/>
         <w:spacing w:before="280" w:after="120"/>
       </w:pPr>
       <w:r>
@@ -3898,7 +4747,7 @@
               <w:rPr>
                 <w:b/>
               </w:rPr>
-              <w:t>2. Mô Hình Ngôn Ngữ (LLM)</w:t>
+              <w:t>2. Ứng Dụng Di Động (React Native)</w:t>
             </w:r>
             <w:r/>
           </w:p>
@@ -3919,6 +4768,113 @@
               <w:spacing w:after="40" w:before="40"/>
             </w:pPr>
             <w:r>
+              <w:t>Ứng dụng di động bị ngắt kết nối khi gọi qua đường truyền Ngrok hoặc chưa xử lý cấp quyền Camera Android.</w:t>
+            </w:r>
+          </w:p>
+        </w:tc>
+        <w:tc>
+          <w:tcPr>
+            <w:tcW w:type="dxa" w:w="3120"/>
+            <w:tcMar>
+              <w:top w:w="120" w:type="dxa"/>
+              <w:bottom w:w="120" w:type="dxa"/>
+              <w:left w:w="180" w:type="dxa"/>
+              <w:right w:w="180" w:type="dxa"/>
+            </w:tcMar>
+            <w:shd w:fill="FFFFFF"/>
+          </w:tcPr>
+          <w:p>
+            <w:pPr>
+              <w:spacing w:after="40" w:before="40"/>
+            </w:pPr>
+            <w:r/>
+            <w:r>
+              <w:rPr>
+                <w:b/>
+              </w:rPr>
+              <w:t>Giải pháp:</w:t>
+            </w:r>
+            <w:r>
+              <w:t xml:space="preserve"> Bổ sung </w:t>
+            </w:r>
+            <w:r>
+              <w:rPr>
+                <w:rFonts w:ascii="Consolas" w:hAnsi="Consolas"/>
+                <w:color w:val="0F766E"/>
+                <w:sz w:val="20"/>
+              </w:rPr>
+              <w:t>PermissionsAndroid.request</w:t>
+            </w:r>
+            <w:r>
+              <w:t xml:space="preserve"> trong </w:t>
+            </w:r>
+            <w:r>
+              <w:rPr>
+                <w:rFonts w:ascii="Consolas" w:hAnsi="Consolas"/>
+                <w:color w:val="0F766E"/>
+                <w:sz w:val="20"/>
+              </w:rPr>
+              <w:t>App.tsx</w:t>
+            </w:r>
+            <w:r>
+              <w:t xml:space="preserve"> và tự động gửi kèm Header </w:t>
+            </w:r>
+            <w:r>
+              <w:rPr>
+                <w:rFonts w:ascii="Consolas" w:hAnsi="Consolas"/>
+                <w:color w:val="0F766E"/>
+                <w:sz w:val="20"/>
+              </w:rPr>
+              <w:t>ngrok-skip-browser-warning: true</w:t>
+            </w:r>
+            <w:r>
+              <w:t xml:space="preserve"> trong mọi HTTP request.</w:t>
+            </w:r>
+          </w:p>
+        </w:tc>
+      </w:tr>
+      <w:tr>
+        <w:tc>
+          <w:tcPr>
+            <w:tcW w:type="dxa" w:w="3120"/>
+            <w:tcMar>
+              <w:top w:w="120" w:type="dxa"/>
+              <w:bottom w:w="120" w:type="dxa"/>
+              <w:left w:w="180" w:type="dxa"/>
+              <w:right w:w="180" w:type="dxa"/>
+            </w:tcMar>
+            <w:shd w:fill="F8FAFC"/>
+          </w:tcPr>
+          <w:p>
+            <w:pPr>
+              <w:spacing w:after="40" w:before="40"/>
+            </w:pPr>
+            <w:r/>
+            <w:r>
+              <w:rPr>
+                <w:b/>
+              </w:rPr>
+              <w:t>3. Mô Hình Ngôn Ngữ (LLM)</w:t>
+            </w:r>
+            <w:r/>
+          </w:p>
+        </w:tc>
+        <w:tc>
+          <w:tcPr>
+            <w:tcW w:type="dxa" w:w="3120"/>
+            <w:tcMar>
+              <w:top w:w="120" w:type="dxa"/>
+              <w:bottom w:w="120" w:type="dxa"/>
+              <w:left w:w="180" w:type="dxa"/>
+              <w:right w:w="180" w:type="dxa"/>
+            </w:tcMar>
+            <w:shd w:fill="F8FAFC"/>
+          </w:tcPr>
+          <w:p>
+            <w:pPr>
+              <w:spacing w:after="40" w:before="40"/>
+            </w:pPr>
+            <w:r>
               <w:t>AI thỉnh thoảng tự sinh thuật ngữ tiếng Trung hoặc sót từ khóa triệu chứng 1 âm tiết (vd: "nôn", "ho").</w:t>
             </w:r>
           </w:p>
@@ -3932,7 +4888,7 @@
               <w:left w:w="180" w:type="dxa"/>
               <w:right w:w="180" w:type="dxa"/>
             </w:tcMar>
-            <w:shd w:fill="FFFFFF"/>
+            <w:shd w:fill="F8FAFC"/>
           </w:tcPr>
           <w:p>
             <w:pPr>
@@ -3983,7 +4939,7 @@
               <w:left w:w="180" w:type="dxa"/>
               <w:right w:w="180" w:type="dxa"/>
             </w:tcMar>
-            <w:shd w:fill="F8FAFC"/>
+            <w:shd w:fill="FFFFFF"/>
           </w:tcPr>
           <w:p>
             <w:pPr>
@@ -3994,7 +4950,7 @@
               <w:rPr>
                 <w:b/>
               </w:rPr>
-              <w:t>3. Truy Xuất Đồ Thị (Neo4j)</w:t>
+              <w:t>4. Truy Xuất Đồ Thị (Neo4j)</w:t>
             </w:r>
             <w:r/>
           </w:p>
@@ -4008,7 +4964,7 @@
               <w:left w:w="180" w:type="dxa"/>
               <w:right w:w="180" w:type="dxa"/>
             </w:tcMar>
-            <w:shd w:fill="F8FAFC"/>
+            <w:shd w:fill="FFFFFF"/>
           </w:tcPr>
           <w:p>
             <w:pPr>
@@ -4028,7 +4984,7 @@
               <w:left w:w="180" w:type="dxa"/>
               <w:right w:w="180" w:type="dxa"/>
             </w:tcMar>
-            <w:shd w:fill="F8FAFC"/>
+            <w:shd w:fill="FFFFFF"/>
           </w:tcPr>
           <w:p>
             <w:pPr>
@@ -4077,7 +5033,7 @@
               <w:left w:w="180" w:type="dxa"/>
               <w:right w:w="180" w:type="dxa"/>
             </w:tcMar>
-            <w:shd w:fill="FFFFFF"/>
+            <w:shd w:fill="F8FAFC"/>
           </w:tcPr>
           <w:p>
             <w:pPr>
@@ -4088,7 +5044,7 @@
               <w:rPr>
                 <w:b/>
               </w:rPr>
-              <w:t>4. An Toàn Y Khoa &amp; Áo Giác</w:t>
+              <w:t>5. An Toàn Y Khoa &amp; Áo Giác</w:t>
             </w:r>
             <w:r/>
           </w:p>
@@ -4102,7 +5058,7 @@
               <w:left w:w="180" w:type="dxa"/>
               <w:right w:w="180" w:type="dxa"/>
             </w:tcMar>
-            <w:shd w:fill="FFFFFF"/>
+            <w:shd w:fill="F8FAFC"/>
           </w:tcPr>
           <w:p>
             <w:pPr>
@@ -4122,7 +5078,7 @@
               <w:left w:w="180" w:type="dxa"/>
               <w:right w:w="180" w:type="dxa"/>
             </w:tcMar>
-            <w:shd w:fill="FFFFFF"/>
+            <w:shd w:fill="F8FAFC"/>
           </w:tcPr>
           <w:p>
             <w:pPr>
@@ -4182,6 +5138,7 @@
     </w:p>
     <w:p>
       <w:pPr>
+        <w:pStyle w:val="Heading2"/>
         <w:spacing w:before="240" w:after="80"/>
       </w:pPr>
       <w:r>
@@ -4216,7 +5173,25 @@
         <w:t>100% mục tiêu đề ra</w:t>
       </w:r>
       <w:r>
-        <w:t xml:space="preserve">. Hệ thống vận hành ổn định, kết hợp nhuần nhuyễn giữa </w:t>
+        <w:t xml:space="preserve">. Hệ thống vận hành ổn định trên cả </w:t>
+      </w:r>
+      <w:r>
+        <w:rPr>
+          <w:b/>
+        </w:rPr>
+        <w:t>Ứng dụng Di động React Native CLI (`DongY` App)</w:t>
+      </w:r>
+      <w:r>
+        <w:t xml:space="preserve"> và </w:t>
+      </w:r>
+      <w:r>
+        <w:rPr>
+          <w:b/>
+        </w:rPr>
+        <w:t>Nền tảng Web App</w:t>
+      </w:r>
+      <w:r>
+        <w:t xml:space="preserve">, kết hợp nhuần nhuyễn giữa </w:t>
       </w:r>
       <w:r>
         <w:rPr>

</xml_diff>

<commit_message>
fix: replace raw ASCII text block diagrams with high-resolution PNG diagram images
</commit_message>
<xml_diff>
--- a/Bao_Cao_Tien_Do_TCM_System.docx
+++ b/Bao_Cao_Tien_Do_TCM_System.docx
@@ -2641,6 +2641,52 @@
     </w:p>
     <w:p>
       <w:pPr>
+        <w:spacing w:before="40" w:after="80" w:line="276" w:lineRule="auto"/>
+      </w:pPr>
+      <w:r>
+        <w:t xml:space="preserve">Để đảm bảo khả năng vận hành liên tục 24/7 không bị gián đoạn do sự cố mạng hay hết quota API, hệ thống tích hợp chuỗi Fallback 3 tầng tự động trong </w:t>
+      </w:r>
+      <w:r>
+        <w:rPr>
+          <w:rFonts w:ascii="Consolas" w:hAnsi="Consolas"/>
+          <w:color w:val="0F766E"/>
+          <w:sz w:val="20"/>
+        </w:rPr>
+        <w:t>src/cloud_vlm_client.py</w:t>
+      </w:r>
+      <w:r>
+        <w:t xml:space="preserve">: </w:t>
+      </w:r>
+      <w:r>
+        <w:rPr>
+          <w:b/>
+        </w:rPr>
+        <w:t>DashScope API (Qwen3-VL-32B-Thinking Cloud)</w:t>
+      </w:r>
+      <w:r>
+        <w:t xml:space="preserve"> $\rightarrow$ </w:t>
+      </w:r>
+      <w:r>
+        <w:rPr>
+          <w:b/>
+        </w:rPr>
+        <w:t>Requesty Router (Parasail Qwen2.5-VL-72B)</w:t>
+      </w:r>
+      <w:r>
+        <w:t xml:space="preserve"> $\rightarrow$ </w:t>
+      </w:r>
+      <w:r>
+        <w:rPr>
+          <w:b/>
+        </w:rPr>
+        <w:t>Ollama Engine (LLaVA-7B Local Engine)</w:t>
+      </w:r>
+      <w:r>
+        <w:t>.</w:t>
+      </w:r>
+    </w:p>
+    <w:p>
+      <w:pPr>
         <w:spacing w:before="200" w:after="80"/>
         <w:jc w:val="center"/>
       </w:pPr>
@@ -2696,52 +2742,6 @@
     </w:p>
     <w:p>
       <w:pPr>
-        <w:spacing w:before="40" w:after="80" w:line="276" w:lineRule="auto"/>
-      </w:pPr>
-      <w:r>
-        <w:t xml:space="preserve">Để đảm bảo khả năng vận hành liên tục 24/7 không bị gián đoạn do sự cố mạng hay hết quota API, hệ thống tích hợp chuỗi Fallback 3 tầng tự động trong </w:t>
-      </w:r>
-      <w:r>
-        <w:rPr>
-          <w:rFonts w:ascii="Consolas" w:hAnsi="Consolas"/>
-          <w:color w:val="0F766E"/>
-          <w:sz w:val="20"/>
-        </w:rPr>
-        <w:t>src/cloud_vlm_client.py</w:t>
-      </w:r>
-      <w:r>
-        <w:t xml:space="preserve">: </w:t>
-      </w:r>
-      <w:r>
-        <w:rPr>
-          <w:b/>
-        </w:rPr>
-        <w:t>DashScope API (Qwen3-VL-32B-Thinking Cloud)</w:t>
-      </w:r>
-      <w:r>
-        <w:t xml:space="preserve"> $\rightarrow$ </w:t>
-      </w:r>
-      <w:r>
-        <w:rPr>
-          <w:b/>
-        </w:rPr>
-        <w:t>Requesty Router (Parasail Qwen2.5-VL-72B)</w:t>
-      </w:r>
-      <w:r>
-        <w:t xml:space="preserve"> $\rightarrow$ </w:t>
-      </w:r>
-      <w:r>
-        <w:rPr>
-          <w:b/>
-        </w:rPr>
-        <w:t>Ollama Engine (LLaVA-7B Local Engine)</w:t>
-      </w:r>
-      <w:r>
-        <w:t>.</w:t>
-      </w:r>
-    </w:p>
-    <w:p>
-      <w:pPr>
         <w:pStyle w:val="Heading3"/>
         <w:spacing w:before="200" w:after="80"/>
       </w:pPr>
@@ -2951,6 +2951,14 @@
           <w:sz w:val="30"/>
         </w:rPr>
         <w:t>II. CẤU TRÚC KIẾN TRÚC HỆ THỐNG VÀ THƯ VIỆN CÔNG NGHỆ</w:t>
+      </w:r>
+    </w:p>
+    <w:p>
+      <w:pPr>
+        <w:spacing w:before="40" w:after="80" w:line="276" w:lineRule="auto"/>
+      </w:pPr>
+      <w:r>
+        <w:t>Hệ thống được phát triển theo mô hình Microservices decoupled toàn diện giữa Mobile App, Frontend Web UI, Backend Core RestAPI và Hệ sinh thái AI Engine / Graph Database:</w:t>
       </w:r>
     </w:p>
     <w:p>
@@ -3006,91 +3014,6 @@
           <w:sz w:val="19"/>
         </w:rPr>
         <w:t>Hình 4: Sơ đồ Kiến trúc Tổng thể Hệ thống Microservices &amp; AI Engine</w:t>
-      </w:r>
-    </w:p>
-    <w:p>
-      <w:pPr>
-        <w:spacing w:before="40" w:after="80" w:line="276" w:lineRule="auto"/>
-      </w:pPr>
-      <w:r>
-        <w:t>Hệ thống được phát triển theo mô hình Microservices decoupled toàn diện giữa Mobile App, Frontend Web UI, Backend Core RestAPI và Hệ sinh thái AI Engine / Graph Database:</w:t>
-      </w:r>
-    </w:p>
-    <w:p>
-      <w:pPr>
-        <w:spacing w:before="80" w:after="160"/>
-      </w:pPr>
-      <w:r>
-        <w:rPr>
-          <w:rFonts w:ascii="Consolas" w:hAnsi="Consolas"/>
-          <w:color w:val="1E293B"/>
-          <w:sz w:val="19"/>
-        </w:rPr>
-        <w:t xml:space="preserve">  ┌─────────────────────────────────┐        ┌──────────────────────────────────┐</w:t>
-        <w:br/>
-        <w:t xml:space="preserve">  │  React Native App (DongY App)   │        │   Frontend Web UI (index.html)   │</w:t>
-        <w:br/>
-        <w:t xml:space="preserve">  │  - iOS / Android Native UI      │        │ - Responsive UI (TailwindCSS)    │</w:t>
-        <w:br/>
-        <w:t xml:space="preserve">  │  - Firebase Auth &amp; User Roles   │        │ - Form Vấn chẩn 10 trường        │</w:t>
-        <w:br/>
-        <w:t xml:space="preserve">  │  - Camera Picker (Mặt/Lưỡi)     │        │ - Vis-Network Interactive Graph  │</w:t>
-        <w:br/>
-        <w:t xml:space="preserve">  └────────────────┬────────────────┘        └─────────────────┬────────────────┘</w:t>
-        <w:br/>
-        <w:t xml:space="preserve">                   │                                           │</w:t>
-        <w:br/>
-        <w:t xml:space="preserve">                   └──────────────────┬────────────────────────┘</w:t>
-        <w:br/>
-        <w:t xml:space="preserve">                                      │ HTTP Request (FormData / JSON)</w:t>
-        <w:br/>
-        <w:t xml:space="preserve">                                      ▼</w:t>
-        <w:br/>
-        <w:t xml:space="preserve">                  ┌────────────────────────────────────────┐</w:t>
-        <w:br/>
-        <w:t xml:space="preserve">                  │     Backend Core API (FastAPI)         │</w:t>
-        <w:br/>
-        <w:t xml:space="preserve">                  │  - CORS Middleware / Async Handler     │</w:t>
-        <w:br/>
-        <w:t xml:space="preserve">                  │  - Firebase Auth Exchange &amp; JWT Token  │</w:t>
-        <w:br/>
-        <w:t xml:space="preserve">                  │  - Data Validation / Temp Image Clean  │</w:t>
-        <w:br/>
-        <w:t xml:space="preserve">                  └───────────────────┬────────────────────┘</w:t>
-        <w:br/>
-        <w:t xml:space="preserve">                                      │</w:t>
-        <w:br/>
-        <w:t xml:space="preserve">                       ┌──────────────┴──────────────┐</w:t>
-        <w:br/>
-        <w:t xml:space="preserve">                       ▼                             ▼</w:t>
-        <w:br/>
-        <w:t xml:space="preserve">      ┌──────────────────────────────┐ ┌──────────────────────────────┐</w:t>
-        <w:br/>
-        <w:t xml:space="preserve">      │ AI Vision Engine             │ │ TCM Fusion Pipeline          │</w:t>
-        <w:br/>
-        <w:t xml:space="preserve">      │ - Cloud VLM (Qwen3-VL-32B)   │ │ - Synonym Normalization      │</w:t>
-        <w:br/>
-        <w:t xml:space="preserve">      │ - Requesty / Ollama Fallback │ │ - Intersection &amp; IDF Scoring │</w:t>
-        <w:br/>
-        <w:t xml:space="preserve">      └──────────────┬───────────────┘ │ - Clinical Gatekeeper        │</w:t>
-        <w:br/>
-        <w:t xml:space="preserve">                     │                 └──────────────┬───────────────┘</w:t>
-        <w:br/>
-        <w:t xml:space="preserve">                     │                                │</w:t>
-        <w:br/>
-        <w:t xml:space="preserve">                     └────────────────┬───────────────┘</w:t>
-        <w:br/>
-        <w:t xml:space="preserve">                                      ▼</w:t>
-        <w:br/>
-        <w:t xml:space="preserve">                  ┌────────────────────────────────────────┐</w:t>
-        <w:br/>
-        <w:t xml:space="preserve">                  │   Graph Database (Neo4j Aura Cloud)    │</w:t>
-        <w:br/>
-        <w:t xml:space="preserve">                  │  - 6 Entity Classes / Cypher Engine    │</w:t>
-        <w:br/>
-        <w:t xml:space="preserve">                  │  - Graph RAG Subgraph Retrieval        │</w:t>
-        <w:br/>
-        <w:t xml:space="preserve">                  └────────────────────────────────────────┘</w:t>
       </w:r>
     </w:p>
     <w:p>
@@ -4371,57 +4294,39 @@
     </w:p>
     <w:p>
       <w:pPr>
-        <w:spacing w:before="200" w:after="80"/>
-        <w:jc w:val="center"/>
-      </w:pPr>
-      <w:r>
-        <w:drawing>
-          <wp:inline xmlns:a="http://schemas.openxmlformats.org/drawingml/2006/main" xmlns:pic="http://schemas.openxmlformats.org/drawingml/2006/picture">
-            <wp:extent cx="4389120" cy="5778082"/>
-            <wp:docPr id="5" name="Picture 5"/>
-            <wp:cNvGraphicFramePr>
-              <a:graphicFrameLocks noChangeAspect="1"/>
-            </wp:cNvGraphicFramePr>
-            <a:graphic>
-              <a:graphicData uri="http://schemas.openxmlformats.org/drawingml/2006/picture">
-                <pic:pic>
-                  <pic:nvPicPr>
-                    <pic:cNvPr id="0" name="diagram1_kg_schema.png"/>
-                    <pic:cNvPicPr/>
-                  </pic:nvPicPr>
-                  <pic:blipFill>
-                    <a:blip r:embed="rId9"/>
-                    <a:stretch>
-                      <a:fillRect/>
-                    </a:stretch>
-                  </pic:blipFill>
-                  <pic:spPr>
-                    <a:xfrm>
-                      <a:off x="0" y="0"/>
-                      <a:ext cx="4389120" cy="5778082"/>
-                    </a:xfrm>
-                    <a:prstGeom prst="rect"/>
-                  </pic:spPr>
-                </pic:pic>
-              </a:graphicData>
-            </a:graphic>
-          </wp:inline>
-        </w:drawing>
-      </w:r>
-    </w:p>
-    <w:p>
-      <w:pPr>
-        <w:spacing w:before="40" w:after="240"/>
-        <w:jc w:val="center"/>
+        <w:spacing w:before="80" w:after="160"/>
       </w:pPr>
       <w:r>
         <w:rPr>
-          <w:rFonts w:ascii="Arial" w:hAnsi="Arial"/>
-          <w:i/>
-          <w:color w:val="4B5563"/>
+          <w:rFonts w:ascii="Consolas" w:hAnsi="Consolas"/>
+          <w:color w:val="1E293B"/>
           <w:sz w:val="19"/>
         </w:rPr>
-        <w:t>Hình 1: Sơ đồ Mối quan hệ giữa các Thực thể trong Đồ thị Tri thức Đông y</w:t>
+        <w:t>// Truy vấn Subgraph từ danh sách triệu chứng Vọng chẩn &amp; Vấn chẩn</w:t>
+        <w:br/>
+        <w:t>MATCH (t:TrieuChung)</w:t>
+        <w:br/>
+        <w:t xml:space="preserve">WHERE toLower(t.name) CONTAINS 'đau lưng' </w:t>
+        <w:br/>
+        <w:t xml:space="preserve">   OR toLower(t.name) CONTAINS 'tiểu đêm'</w:t>
+        <w:br/>
+        <w:t xml:space="preserve">   OR toLower(t.name) CONTAINS 'mặt nhợt nhạt'</w:t>
+        <w:br/>
+        <w:t>MATCH (b:BenhLy)-[:CHIA_THÀNH]-&gt;(h:HoiChung)-[:CÓ_BIỂU_HIỆN]-&gt;(t)</w:t>
+        <w:br/>
+        <w:t>MATCH (h)-[:ĐỊNH_VỊ_BÁT_CƯƠNG]-&gt;(bc:BatCuong)</w:t>
+        <w:br/>
+        <w:t>OPTIONAL MATCH (h)-[:ĐƯỢC_ĐIỀU_TRỊ_BẰNG]-&gt;(p:BaiThuoc)-[:BAO_GỒM]-&gt;(v:ViThuoc)</w:t>
+        <w:br/>
+        <w:t xml:space="preserve">RETURN b.name AS BenhDanh, </w:t>
+        <w:br/>
+        <w:t xml:space="preserve">       h.name AS HoiChung, </w:t>
+        <w:br/>
+        <w:t xml:space="preserve">       bc.name AS BatCuong, </w:t>
+        <w:br/>
+        <w:t xml:space="preserve">       p.name AS BaiThuoc, </w:t>
+        <w:br/>
+        <w:t xml:space="preserve">       collect(DISTINCT v.name) AS DanhSachViThuoc</w:t>
       </w:r>
     </w:p>
     <w:p>

</xml_diff>